<commit_message>
docs: registra decisões de pagamento, estorno automático e login do operador
</commit_message>
<xml_diff>
--- a/docs/Documentação-Proj_01.docx
+++ b/docs/Documentação-Proj_01.docx
@@ -1782,7 +1782,7 @@
         <w:jc w:val="both"/>
       </w:pPr>
       <w:r>
-        <w:t xml:space="preserve">No Pix, recebe o QR Code e o código copia e cola, com prazo de 15 minutos para pagar; a tela aguarda a confirmação e se atualiza sozinha. No cartão, preenche os dados em um formulário seguro; se o cartão for recusado, pode tentar novamente ou trocar para Pix sem refazer o pedido.</w:t>
+        <w:t xml:space="preserve">No Pix, recebe o QR Code e o código copia e cola, com prazo de 15 minutos para pagar; a tela aguarda a confirmação e se atualiza sozinha. No cartão, preenche os dados em um formulário seguro; se o cartão for recusado, pode tentar novamente ou trocar para Pix sem refazer o pedido. Também é possível trocar do Pix para o cartão: nesse caso, o Pix gerado é cancelado e deixa de poder ser pago.</w:t>
       </w:r>
     </w:p>
     <w:p>
@@ -1883,7 +1883,7 @@
         <w:jc w:val="both"/>
       </w:pPr>
       <w:r>
-        <w:t xml:space="preserve">Abre o aplicativo nativo no celular do bar e insere o código de seis caracteres. Após cinco tentativas incorretas, o dispositivo precisa aguardar alguns minutos antes de tentar novamente.</w:t>
+        <w:t xml:space="preserve">Abre o aplicativo nativo no celular do bar e insere o código de seis caracteres. Após cinco tentativas incorretas, novas tentativas vindas da mesma conexão (endereço IP) ficam bloqueadas por alguns minutos.</w:t>
       </w:r>
     </w:p>
     <w:p>
@@ -2646,7 +2646,7 @@
         <w:jc w:val="both"/>
       </w:pPr>
       <w:r>
-        <w:t xml:space="preserve">Código de acesso do operador protegido: o código possui seis caracteres alfanuméricos, sem caracteres que se confundem, como 0 e O, o que resulta em cerca de um bilhão de combinações. O backend limita as tentativas de login e armazena apenas o hash do código, nunca o código em texto puro.</w:t>
+        <w:t xml:space="preserve">Código de acesso do operador protegido: o código possui seis caracteres alfanuméricos, sem caracteres que se confundem, como 0 e O, o que resulta em cerca de um bilhão de combinações. O backend limita as tentativas de login a cinco por endereço IP, com bloqueio temporário, e armazena apenas o hash do código, nunca o código em texto puro. No MVP, a contagem de tentativas fica na memória do servidor, o que funciona com a instância única do backend na Railway. Essa é uma limitação conhecida: quando o backend passar a rodar em mais de uma instância, a contagem deve ir para o banco de dados ou para um cache compartilhado.</w:t>
       </w:r>
     </w:p>
     <w:p>
@@ -4091,7 +4091,7 @@
         <w:jc w:val="both"/>
       </w:pPr>
       <w:r>
-        <w:t xml:space="preserve">O consumidor escolhe a forma de pagamento e o backend cria uma tentativa de pagamento na tabela payments, acionando a API do Pagar.me com as regras de split. No cartão, os dados são tokenizados diretamente pelo Pagar.me no aplicativo, e o número do cartão nunca passa pelo backend nem é armazenado.</w:t>
+        <w:t xml:space="preserve">O consumidor escolhe a forma de pagamento e o backend cria uma tentativa de pagamento na tabela payments, acionando a API do Pagar.me com as regras de split. No cartão, os dados são tokenizados diretamente pelo Pagar.me no aplicativo, e o número do cartão nunca passa pelo backend nem é armazenado. No Pix, a cobrança é criada no Pagar.me com expiração no mesmo horário limite do pedido, 15 minutos após a sua criação, de modo que o próprio Pagar.me recusa o pagamento depois do prazo.</w:t>
       </w:r>
     </w:p>
     <w:p>
@@ -4106,7 +4106,7 @@
         <w:jc w:val="both"/>
       </w:pPr>
       <w:r>
-        <w:t xml:space="preserve">O Pagar.me informa o resultado ao backend por webhook. Cada aviso recebido é registrado na tabela payment_webhooks; se o mesmo aviso chegar mais de uma vez, ele é identificado e não é processado novamente, o que torna a operação idempotente.</w:t>
+        <w:t xml:space="preserve">Cada pedido tem no máximo uma tentativa pendente por vez: enquanto houver uma tentativa com status pending, o backend não cria outra. Se o consumidor quiser trocar do Pix para o cartão, o backend primeiro cancela a cobrança Pix pendente no Pagar.me, marca a tentativa como cancelled e só então cria a tentativa no cartão. Se o cancelamento não for possível porque o Pix acabou de ser pago, a troca é recusada e o pedido segue o fluxo normal de pagamento aprovado.</w:t>
       </w:r>
     </w:p>
     <w:p>
@@ -4121,7 +4121,7 @@
         <w:jc w:val="both"/>
       </w:pPr>
       <w:r>
-        <w:t xml:space="preserve">Com o pagamento aprovado, o pedido passa para paid e o QR Code de retirada é exibido na tela do consumidor. A confirmação nunca é aceita com base em informação enviada pelo aplicativo.</w:t>
+        <w:t xml:space="preserve">O Pagar.me informa o resultado ao backend por webhook. Cada aviso recebido é registrado na tabela payment_webhooks; se o mesmo aviso chegar mais de uma vez, ele é identificado e não é processado novamente, o que torna a operação idempotente.</w:t>
       </w:r>
     </w:p>
     <w:p>
@@ -4136,7 +4136,37 @@
         <w:jc w:val="both"/>
       </w:pPr>
       <w:r>
+        <w:t xml:space="preserve">Com o pagamento aprovado, o pedido passa para paid e o QR Code de retirada é exibido na tela do consumidor. A confirmação nunca é aceita com base em informação enviada pelo aplicativo.</w:t>
+      </w:r>
+    </w:p>
+    <w:p>
+      <w:pPr>
+        <w:pStyle w:val="PargrafodaLista"/>
+        <w:numPr>
+          <w:ilvl w:val="0"/>
+          <w:numId w:val="2"/>
+        </w:numPr>
+        <w:spacing w:line="360" w:lineRule="auto"/>
+        <w:ind w:firstLine="706"/>
+        <w:jc w:val="both"/>
+      </w:pPr>
+      <w:r>
         <w:t xml:space="preserve">Se uma tentativa falhar, como um cartão recusado, apenas a tentativa fica com o status failed. O pedido continua aguardando pagamento e o consumidor pode tentar novamente, com outro cartão ou com Pix. Se nenhuma tentativa for aprovada em 15 minutos, o pedido passa para expired e nenhum valor é cobrado.</w:t>
+      </w:r>
+    </w:p>
+    <w:p>
+      <w:pPr>
+        <w:pStyle w:val="PargrafodaLista"/>
+        <w:numPr>
+          <w:ilvl w:val="0"/>
+          <w:numId w:val="2"/>
+        </w:numPr>
+        <w:spacing w:line="360" w:lineRule="auto"/>
+        <w:ind w:firstLine="706"/>
+        <w:jc w:val="both"/>
+      </w:pPr>
+      <w:r>
+        <w:t xml:space="preserve">Estorno automático do sistema: apesar das proteções acima, o backend trata dois casos raros sem intervenção manual. Se chegar a confirmação de um pagamento para um pedido que já está expired, o valor integral dessa tentativa é estornado automaticamente, com o motivo late_payment, e o pedido continua expired. Se uma segunda tentativa for aprovada para um pedido que já foi pago, essa segunda tentativa é estornada automaticamente, com o motivo duplicate_payment, e o pedido mantém o status atual. Esses estornos são registrados na tabela refunds sem operador (operator_id vazio), não têm itens em refund_items e não entram em orders.refunded_amount, que soma apenas os estornos de itens do pedido.</w:t>
       </w:r>
     </w:p>
     <w:p>
@@ -4517,7 +4547,7 @@
         <w:jc w:val="both"/>
       </w:pPr>
       <w:r>
-        <w:t xml:space="preserve">As transições possíveis são: awaiting_payment para paid ou expired; paid para in_service; in_service para collected, refunded ou de volta para paid, quando o atendimento é cancelado. Estornos parciais não alteram o status: o valor devolvido é registrado no campo refunded_amount e na tabela refunds, e o pedido segue para collected com os itens restantes.</w:t>
+        <w:t xml:space="preserve">As transições possíveis são: awaiting_payment para paid ou expired; paid para in_service; in_service para collected, refunded ou de volta para paid, quando o atendimento é cancelado. Estornos parciais não alteram o status: o valor devolvido é registrado no campo refunded_amount e na tabela refunds, e o pedido segue para collected com os itens restantes. Os estornos automáticos do sistema (late_payment e duplicate_payment) também não alteram o status do pedido.</w:t>
       </w:r>
     </w:p>
     <w:p/>
@@ -14560,7 +14590,7 @@
               <w:rPr>
                 <w:sz w:val="18"/>
               </w:rPr>
-              <w:t xml:space="preserve">Código alfanumérico exibido no comprovante do consumidor para identificação visual do pedido</w:t>
+              <w:t xml:space="preserve">Código exibido no comprovante do consumidor para identificação visual do pedido, no formato GH7-382: duas letras, um dígito, hífen e três dígitos, sem caracteres que se confundem (0 e O, 1 e I). Gerado aleatoriamente; único dentro do evento, e em caso de colisão um novo código é gerado</w:t>
             </w:r>
           </w:p>
         </w:tc>
@@ -14724,7 +14754,7 @@
               <w:rPr>
                 <w:sz w:val="18"/>
               </w:rPr>
-              <w:t xml:space="preserve">Soma dos valores estornados ao consumidor. Inicia em zero</w:t>
+              <w:t xml:space="preserve">Soma dos valores de itens do pedido estornados ao consumidor. Inicia em zero. Não inclui os estornos automáticos do sistema (late_payment e duplicate_payment)</w:t>
             </w:r>
           </w:p>
         </w:tc>
@@ -16494,7 +16524,7 @@
               <w:rPr>
                 <w:sz w:val="18"/>
               </w:rPr>
-              <w:t xml:space="preserve">Estado da tentativa: pending, paid, failed ou expired</w:t>
+              <w:t xml:space="preserve">Estado da tentativa: pending, paid, failed, expired ou cancelled (Pix cancelado quando o consumidor troca para o cartão). Cada pedido tem no máximo uma tentativa pending por vez</w:t>
             </w:r>
           </w:p>
         </w:tc>
@@ -16822,7 +16852,7 @@
               <w:rPr>
                 <w:sz w:val="18"/>
               </w:rPr>
-              <w:t xml:space="preserve">Prazo de pagamento do Pix (15 minutos). Não se aplica ao cartão</w:t>
+              <w:t xml:space="preserve">Prazo de pagamento do Pix, igual ao horário limite do pedido (15 minutos após a criação do pedido) e enviado ao Pagar.me como expiração da cobrança. Não se aplica ao cartão</w:t>
             </w:r>
           </w:p>
         </w:tc>
@@ -17735,7 +17765,7 @@
         <w:jc w:val="both"/>
       </w:pPr>
       <w:r>
-        <w:t xml:space="preserve">Registra cada estorno realizado, parcial ou total, com o operador responsável, permitindo a auditoria pelo estabelecimento.</w:t>
+        <w:t xml:space="preserve">Registra cada estorno realizado, parcial ou total, com o operador responsável, permitindo a auditoria pelo estabelecimento. Também registra os estornos automáticos feitos pelo sistema, sem operador: pagamento confirmado depois de o pedido expirar e pagamento em duplicidade.</w:t>
       </w:r>
     </w:p>
     <w:p/>
@@ -18163,7 +18193,7 @@
               <w:rPr>
                 <w:sz w:val="18"/>
               </w:rPr>
-              <w:t xml:space="preserve">Sim</w:t>
+              <w:t xml:space="preserve">Não</w:t>
             </w:r>
           </w:p>
         </w:tc>
@@ -18182,7 +18212,7 @@
               <w:rPr>
                 <w:sz w:val="18"/>
               </w:rPr>
-              <w:t xml:space="preserve">Referência ao operador que registrou o estorno. Chave estrangeira para a tabela operators</w:t>
+              <w:t xml:space="preserve">Referência ao operador que registrou o estorno. Chave estrangeira para a tabela operators. Vazio nos estornos automáticos do sistema</w:t>
             </w:r>
           </w:p>
         </w:tc>
@@ -18346,7 +18376,7 @@
               <w:rPr>
                 <w:sz w:val="18"/>
               </w:rPr>
-              <w:t xml:space="preserve">Motivo do estorno: item_sold_out (item esgotado) ou order_cancelled (pedido inteiro estornado)</w:t>
+              <w:t xml:space="preserve">Motivo do estorno: item_sold_out (item esgotado) ou order_cancelled (pedido inteiro estornado), registrados pelo operador; late_payment (pagamento confirmado após a expiração do pedido) ou duplicate_payment (segunda tentativa aprovada para o mesmo pedido), registrados automaticamente pelo sistema. operator_id é obrigatório nos dois primeiros e vazio nos dois últimos (restrição CHECK)</w:t>
             </w:r>
           </w:p>
         </w:tc>
@@ -18620,7 +18650,7 @@
         <w:jc w:val="both"/>
       </w:pPr>
       <w:r>
-        <w:t xml:space="preserve">Registra quais itens e quantidades fizeram parte de cada estorno.</w:t>
+        <w:t xml:space="preserve">Registra quais itens e quantidades fizeram parte de cada estorno. Os estornos automáticos do sistema (late_payment e duplicate_payment) devolvem a tentativa de pagamento inteira e não possuem registros nesta tabela.</w:t>
       </w:r>
     </w:p>
     <w:p/>

</xml_diff>

<commit_message>
docs: troca o Pagar.me pelo Mercado Pago e remove os estornos do MVP
</commit_message>
<xml_diff>
--- a/docs/Documentação-Proj_01.docx
+++ b/docs/Documentação-Proj_01.docx
@@ -228,7 +228,7 @@
         <w:t xml:space="preserve">Palavras-chave: </w:t>
       </w:r>
       <w:r>
-        <w:t xml:space="preserve">Plataforma digital. Eventos. Pedidos online. Eliminação de filas. Flutter. Node.js. Supabase. Pagar.me.</w:t>
+        <w:t xml:space="preserve">Plataforma digital. Eventos. Pedidos online. Eliminação de filas. Flutter. Node.js. Supabase. Mercado Pago.</w:t>
       </w:r>
     </w:p>
     <w:p/>
@@ -482,77 +482,73 @@
         <w:br/>
         <w:t xml:space="preserve">    5.1 Fluxo do Cliente .................................................... 13</w:t>
         <w:br/>
-        <w:t xml:space="preserve">    5.2 Fluxo do Operador de Bar ............................................ 14</w:t>
+        <w:t xml:space="preserve">    5.2 Fluxo do Operador de Bar ............................................ 15</w:t>
         <w:br/>
         <w:t xml:space="preserve">    5.3 Fluxo do Estabelecimento ............................................ 16</w:t>
         <w:br/>
         <w:t xml:space="preserve">    5.4 Canais de Acesso do Consumidor ...................................... 17</w:t>
         <w:br/>
-        <w:t xml:space="preserve">6 SEGURANÇA E ANTIFRAUDE .................................................... 17</w:t>
+        <w:t xml:space="preserve">6 SEGURANÇA E ANTIFRAUDE .................................................... 18</w:t>
         <w:br/>
-        <w:t xml:space="preserve">7 ARQUITETURA TÉCNICA ....................................................... 19</w:t>
+        <w:t xml:space="preserve">7 ARQUITETURA TÉCNICA ....................................................... 20</w:t>
         <w:br/>
-        <w:t xml:space="preserve">    7.1 Stack Tecnológica ................................................... 19</w:t>
+        <w:t xml:space="preserve">    7.1 Stack Tecnológica ................................................... 20</w:t>
         <w:br/>
-        <w:t xml:space="preserve">    7.2 Fases da Infraestrutura ............................................. 20</w:t>
+        <w:t xml:space="preserve">    7.2 Fases da Infraestrutura ............................................. 21</w:t>
         <w:br/>
         <w:t xml:space="preserve">    7.3 Autenticação por Perfil ............................................. 21</w:t>
         <w:br/>
-        <w:t xml:space="preserve">    7.4 Fluxo de Pagamento .................................................. 22</w:t>
+        <w:t xml:space="preserve">    7.4 Fluxo de Pagamento .................................................. 23</w:t>
         <w:br/>
-        <w:t xml:space="preserve">    7.5 Rotas da API ........................................................ 24</w:t>
+        <w:t xml:space="preserve">    7.5 Rotas da API ........................................................ 25</w:t>
         <w:br/>
-        <w:t xml:space="preserve">        7.5.1 Rotas públicas e do consumidor ................................ 24</w:t>
+        <w:t xml:space="preserve">        7.5.1 Rotas públicas e do consumidor ................................ 25</w:t>
         <w:br/>
-        <w:t xml:space="preserve">        7.5.2 Rotas do operador ............................................. 24</w:t>
+        <w:t xml:space="preserve">        7.5.2 Rotas do operador ............................................. 25</w:t>
         <w:br/>
-        <w:t xml:space="preserve">        7.5.3 Rotas do estabelecimento ...................................... 25</w:t>
+        <w:t xml:space="preserve">        7.5.3 Rotas do estabelecimento ...................................... 26</w:t>
         <w:br/>
-        <w:t xml:space="preserve">        7.5.4 Rotas do administrador ........................................ 25</w:t>
+        <w:t xml:space="preserve">        7.5.4 Rotas do administrador ........................................ 26</w:t>
         <w:br/>
-        <w:t xml:space="preserve">        7.5.5 Integrações e sistema ......................................... 26</w:t>
+        <w:t xml:space="preserve">        7.5.5 Integrações e sistema ......................................... 27</w:t>
         <w:br/>
-        <w:t xml:space="preserve">8 DICIONÁRIO DE DADOS ....................................................... 26</w:t>
+        <w:t xml:space="preserve">8 DICIONÁRIO DE DADOS ....................................................... 27</w:t>
         <w:br/>
-        <w:t xml:space="preserve">    8.1 Tabela: establishments .............................................. 27</w:t>
+        <w:t xml:space="preserve">    8.1 Tabela: establishments .............................................. 28</w:t>
         <w:br/>
-        <w:t xml:space="preserve">    8.2 Tabela: menus ....................................................... 27</w:t>
+        <w:t xml:space="preserve">    8.2 Tabela: menus ....................................................... 28</w:t>
         <w:br/>
-        <w:t xml:space="preserve">    8.3 Tabela: menu_template_items ......................................... 28</w:t>
+        <w:t xml:space="preserve">    8.3 Tabela: menu_template_items ......................................... 29</w:t>
         <w:br/>
-        <w:t xml:space="preserve">    8.4 Tabela: events ...................................................... 28</w:t>
+        <w:t xml:space="preserve">    8.4 Tabela: events ...................................................... 29</w:t>
         <w:br/>
-        <w:t xml:space="preserve">    8.5 Tabela: menu_items .................................................. 29</w:t>
+        <w:t xml:space="preserve">    8.5 Tabela: menu_items .................................................. 30</w:t>
         <w:br/>
-        <w:t xml:space="preserve">    8.6 Tabela: operators ................................................... 29</w:t>
+        <w:t xml:space="preserve">    8.6 Tabela: operators ................................................... 30</w:t>
         <w:br/>
-        <w:t xml:space="preserve">    8.7 Tabela: orders ...................................................... 30</w:t>
+        <w:t xml:space="preserve">    8.7 Tabela: orders ...................................................... 31</w:t>
         <w:br/>
-        <w:t xml:space="preserve">    8.8 Tabela: order_items ................................................. 30</w:t>
+        <w:t xml:space="preserve">    8.8 Tabela: order_items ................................................. 32</w:t>
         <w:br/>
-        <w:t xml:space="preserve">    8.9 Tabela: payments .................................................... 31</w:t>
+        <w:t xml:space="preserve">    8.9 Tabela: payments .................................................... 32</w:t>
         <w:br/>
-        <w:t xml:space="preserve">    8.10 Tabela: payment_webhooks ........................................... 31</w:t>
-        <w:br/>
-        <w:t xml:space="preserve">    8.11 Tabela: refunds .................................................... 32</w:t>
-        <w:br/>
-        <w:t xml:space="preserve">    8.12 Tabela: refund_items ............................................... 32</w:t>
+        <w:t xml:space="preserve">    8.10 Tabela: payment_webhooks ........................................... 33</w:t>
         <w:br/>
         <w:t xml:space="preserve">9 MODELO DE NEGÓCIO ......................................................... 33</w:t>
         <w:br/>
         <w:t xml:space="preserve">    9.1 Modelo de Receita ................................................... 33</w:t>
         <w:br/>
-        <w:t xml:space="preserve">    9.2 Projeção de Receita ................................................. 33</w:t>
+        <w:t xml:space="preserve">    9.2 Projeção de Receita ................................................. 34</w:t>
         <w:br/>
         <w:t xml:space="preserve">    9.3 Estratégia de Crescimento ........................................... 34</w:t>
         <w:br/>
-        <w:t xml:space="preserve">10 PROTÓTIPOS ............................................................... 34</w:t>
+        <w:t xml:space="preserve">10 PROTÓTIPOS ............................................................... 35</w:t>
         <w:br/>
         <w:t xml:space="preserve">11 ROADMAP DE DESENVOLVIMENTO ............................................... 36</w:t>
         <w:br/>
-        <w:t xml:space="preserve">12 CONSIDERAÇÕES FINAIS ..................................................... 36</w:t>
+        <w:t xml:space="preserve">12 CONSIDERAÇÕES FINAIS ..................................................... 37</w:t>
         <w:br/>
-        <w:t xml:space="preserve">REFERÊNCIAS ................................................................. 38</w:t>
+        <w:t xml:space="preserve">REFERÊNCIAS ................................................................. 39</w:t>
       </w:r>
     </w:p>
     <w:p>
@@ -978,7 +974,7 @@
         <w:jc w:val="both"/>
       </w:pPr>
       <w:r>
-        <w:t xml:space="preserve">Ao escanear o QR Code, o consumidor é direcionado para uma tela que exibe os eventos do estabelecimento que estão acontecendo naquele momento e os que começam em breve. Com um único toque no evento desejado, acessa o cardápio, que exibe o nome do evento no topo durante toda a compra. A partir daí, escolhe os itens, informa as quantidades e realiza o pagamento via Pix ou cartão de crédito. Assim que o Pagar.me confirma o pagamento, a tela exibe o comprovante com um QR Code único gerado para aquele pedido. Para retirar o produto, basta se dirigir ao balcão e apresentar esse QR Code ao operador.</w:t>
+        <w:t xml:space="preserve">Ao escanear o QR Code, o consumidor é direcionado para uma tela que exibe os eventos do estabelecimento que estão acontecendo naquele momento e os que começam em breve. Com um único toque no evento desejado, acessa o cardápio, que exibe o nome do evento no topo durante toda a compra. A partir daí, escolhe os itens, informa as quantidades e realiza o pagamento via Pix ou cartão de crédito. Assim que o Mercado Pago confirma o pagamento, a tela exibe o comprovante com um QR Code único gerado para aquele pedido. Para retirar o produto, basta se dirigir ao balcão e apresentar esse QR Code ao operador.</w:t>
       </w:r>
     </w:p>
     <w:p/>
@@ -1189,7 +1185,7 @@
         <w:jc w:val="both"/>
       </w:pPr>
       <w:r>
-        <w:t xml:space="preserve">O administrador é o próprio desenvolvedor e gestor da plataforma. Possui acesso irrestrito a todos os dados e funcionalidades do sistema. É responsável por aprovar o cadastro de novos estabelecimentos, monitorar a saúde operacional da plataforma, gerenciar a infraestrutura técnica e resolver eventuais inconsistências nos dados. O administrador não interage com os eventos diretamente, mas tem visibilidade total sobre todos os estabelecimentos, eventos, pedidos e operadores cadastrados na plataforma. O perfil é identificado por uma marcação no próprio usuário do Supabase Auth, que só pode ser alterada pelo servidor. O acesso ocorre por um painel web com quatro áreas: visão geral do dia, com os eventos acontecendo e o movimento da plataforma; faturamento mensal, com a quantidade de vendas, o valor transacionado, os estornos e a receita da plataforma, no total e por estabelecimento; busca de pedido pelo código, com os itens, as tentativas de pagamento, os estornos e o histórico de atendimento, para dar suporte aos estabelecimentos; e análise de cadastros, com as ações de aprovar ou rejeitar.</w:t>
+        <w:t xml:space="preserve">O administrador é o próprio desenvolvedor e gestor da plataforma. Possui acesso irrestrito a todos os dados e funcionalidades do sistema. É responsável por aprovar o cadastro de novos estabelecimentos, monitorar a saúde operacional da plataforma, gerenciar a infraestrutura técnica e resolver eventuais inconsistências nos dados. O administrador não interage com os eventos diretamente, mas tem visibilidade total sobre todos os estabelecimentos, eventos, pedidos e operadores cadastrados na plataforma. O perfil é identificado por uma marcação no próprio usuário do Supabase Auth, que só pode ser alterada pelo servidor. O acesso ocorre por um painel web com quatro áreas: visão geral do dia, com os eventos acontecendo e o movimento da plataforma; faturamento mensal, com a quantidade de vendas, o valor transacionado e a receita da plataforma, no total e por estabelecimento; busca de pedido pelo código, com os itens, as tentativas de pagamento e o histórico de atendimento, para dar suporte aos estabelecimentos; e análise de cadastros, com as ações de aprovar ou rejeitar.</w:t>
       </w:r>
     </w:p>
     <w:p/>
@@ -1213,7 +1209,7 @@
         <w:jc w:val="both"/>
       </w:pPr>
       <w:r>
-        <w:t xml:space="preserve">O estabelecimento representa a casa de show, o bar, o produtor cultural ou qualquer gestor de espaço de entretenimento que utiliza a plataforma para gerenciar a venda de consumação em seus eventos. Esse perfil concentra todas as responsabilidades de configuração e acompanhamento: cadastrar e publicar eventos, criar cardápios reutilizáveis com itens, preços e categorias, gerenciar os operadores de bar e acompanhar em tempo real os pedidos realizados e o faturamento acumulado. O cadastro exige CPF ou CNPJ, o que permite que produtores culturais pessoa física também utilizem a plataforma, e o acesso ao painel web é realizado com e-mail e senha.</w:t>
+        <w:t xml:space="preserve">O estabelecimento representa a casa de show, o bar, o produtor cultural ou qualquer gestor de espaço de entretenimento que utiliza a plataforma para gerenciar a venda de consumação em seus eventos. Esse perfil concentra todas as responsabilidades de configuração e acompanhamento: cadastrar e publicar eventos, criar cardápios reutilizáveis com itens, preços e categorias, gerenciar os operadores de bar e acompanhar em tempo real os pedidos realizados e o faturamento acumulado. O cadastro exige CPF ou CNPJ, o que permite que produtores culturais pessoa física também utilizem a plataforma, e a conexão de uma conta Mercado Pago, onde o estabelecimento recebe as vendas. O acesso ao painel web é realizado com e-mail e senha.</w:t>
       </w:r>
     </w:p>
     <w:p/>
@@ -1238,7 +1234,7 @@
         <w:jc w:val="both"/>
       </w:pPr>
       <w:r>
-        <w:t xml:space="preserve">O operador de bar é o funcionário responsável por um balcão de atendimento durante o evento. Seu papel na plataforma é exclusivamente operacional: atender os pedidos, confirmar a entrega e, quando um item acabar, registrar o estorno correspondente. Para acessar o sistema, o operador utiliza um aplicativo nativo instalado no celular do bar e digita um código de acesso individual de seis caracteres, gerado pelo estabelecimento especificamente para aquele evento. Cada operador possui seu próprio código, o que permite ao estabelecimento rastrear individualmente a atuação de cada funcionário e revogar acessos de forma pontual a qualquer momento. O cadastro do operador pode incluir o nome do balcão em que ele atua, utilizado apenas como informação no painel e nas mensagens do aplicativo. O código expira automaticamente ao término do evento, eliminando a necessidade de gerenciamento manual de acessos após o fim da operação.</w:t>
+        <w:t xml:space="preserve">O operador de bar é o funcionário responsável por um balcão de atendimento durante o evento. Seu papel na plataforma é exclusivamente operacional: atender os pedidos e confirmar a entrega, indicando os itens que acabaram, quando for o caso. Para acessar o sistema, o operador utiliza um aplicativo nativo instalado no celular do bar e digita um código de acesso individual de seis caracteres, gerado pelo estabelecimento especificamente para aquele evento. Cada operador possui seu próprio código, o que permite ao estabelecimento rastrear individualmente a atuação de cada funcionário e revogar acessos de forma pontual a qualquer momento. O cadastro do operador pode incluir o nome do balcão em que ele atua, utilizado apenas como informação no painel e nas mensagens do aplicativo. O código expira automaticamente ao término do evento, eliminando a necessidade de gerenciamento manual de acessos após o fim da operação.</w:t>
       </w:r>
     </w:p>
     <w:p/>
@@ -1737,7 +1733,7 @@
         <w:jc w:val="both"/>
       </w:pPr>
       <w:r>
-        <w:t xml:space="preserve">Visualiza o cardápio do evento, organizado por categorias, com nome, emoji e preço de cada item. Itens esgotados aparecem acinzentados, com o selo "Esgotado", e não podem ser adicionados.</w:t>
+        <w:t xml:space="preserve">Visualiza o cardápio do evento, organizado por categorias, com nome, emoji e preço de cada item. Itens esgotados continuam visíveis no cardápio, acinzentados e com o selo "Esgotado" em destaque, mas não podem ser adicionados ao pedido.</w:t>
       </w:r>
     </w:p>
     <w:p>
@@ -1782,7 +1778,7 @@
         <w:jc w:val="both"/>
       </w:pPr>
       <w:r>
-        <w:t xml:space="preserve">No Pix, recebe o QR Code e o código copia e cola, com prazo de 15 minutos para pagar; a tela aguarda a confirmação e se atualiza sozinha. No cartão, preenche os dados em um formulário seguro; se o cartão for recusado, pode tentar novamente ou trocar para Pix sem refazer o pedido. Também é possível trocar do Pix para o cartão: nesse caso, o Pix gerado é cancelado e deixa de poder ser pago.</w:t>
+        <w:t xml:space="preserve">No Pix, recebe o QR Code e o código copia e cola, com prazo de 15 minutos para pagar; a tela aguarda a confirmação e se atualiza sozinha. No cartão, preenche os dados no formulário seguro do Mercado Pago; se o cartão for recusado, pode tentar novamente ou trocar para Pix sem refazer o pedido. Também é possível trocar do Pix para o cartão: nesse caso, o Pix gerado é cancelado e deixa de poder ser pago.</w:t>
       </w:r>
     </w:p>
     <w:p>
@@ -1883,7 +1879,7 @@
         <w:jc w:val="both"/>
       </w:pPr>
       <w:r>
-        <w:t xml:space="preserve">Abre o aplicativo nativo no celular do bar e insere o código de seis caracteres. Após cinco tentativas incorretas, novas tentativas vindas da mesma conexão (endereço IP) ficam bloqueadas por alguns minutos.</w:t>
+        <w:t xml:space="preserve">Abre o aplicativo nativo no celular do bar e insere o código de seis caracteres. Após cinco tentativas incorretas, novas tentativas vindas do mesmo endereço de rede ficam bloqueadas por alguns minutos.</w:t>
       </w:r>
     </w:p>
     <w:p>
@@ -1973,7 +1969,7 @@
         <w:jc w:val="both"/>
       </w:pPr>
       <w:r>
-        <w:t xml:space="preserve">Se algum item tiver acabado, marca o item como esgotado: o valor correspondente é estornado ao consumidor, o item deixa de ser vendido no cardápio do evento e o operador entrega o restante do pedido. Se o consumidor não quiser mais nada, o operador pode estornar o pedido inteiro.</w:t>
+        <w:t xml:space="preserve">Se algum item tiver acabado, toca em "Acabou" ao lado do item. Ao confirmar a entrega, esse item fica registrado no pedido como não entregue e passa a aparecer como esgotado no cardápio do evento, e o aplicativo lembra o operador de combinar com o consumidor uma troca ou a devolução do valor, que é feita pelo próprio estabelecimento, fora da plataforma.</w:t>
       </w:r>
     </w:p>
     <w:p>
@@ -1988,7 +1984,7 @@
         <w:jc w:val="both"/>
       </w:pPr>
       <w:r>
-        <w:t xml:space="preserve">Se o atendimento precisar ser interrompido sem falta de produto, por exemplo porque o consumidor se afastou ou o QR Code foi lido por engano, pressiona "Cancelar atendimento": o pedido volta a ficar disponível para retirada, sem estorno.</w:t>
+        <w:t xml:space="preserve">Se o atendimento precisar ser interrompido, por exemplo porque o consumidor se afastou ou o QR Code foi lido por engano, pressiona "Cancelar atendimento": o pedido volta a ficar disponível para retirada.</w:t>
       </w:r>
     </w:p>
     <w:p>
@@ -2043,7 +2039,7 @@
         <w:jc w:val="both"/>
       </w:pPr>
       <w:r>
-        <w:t xml:space="preserve">Realiza o cadastro na plataforma informando nome, e-mail, senha, CPF ou CNPJ, o identificador do link público (por exemplo, bar-do-ze) e os dados bancários. Os dados bancários são enviados diretamente ao Pagar.me para criar a conta de recebedor e não ficam armazenados na plataforma.</w:t>
+        <w:t xml:space="preserve">Realiza o cadastro na plataforma informando nome, e-mail, senha, CPF ou CNPJ e o identificador do link público (por exemplo, bar-do-ze). Em seguida, conecta a conta Mercado Pago do estabelecimento pelo botão "Conectar Mercado Pago": faz login no próprio Mercado Pago e autoriza a plataforma a criar cobranças em seu nome. A senha do Mercado Pago nunca passa pela plataforma, e nenhum dado bancário é armazenado.</w:t>
       </w:r>
     </w:p>
     <w:p>
@@ -2058,7 +2054,7 @@
         <w:jc w:val="both"/>
       </w:pPr>
       <w:r>
-        <w:t xml:space="preserve">Enquanto aguarda a aprovação do administrador, já pode acessar o painel e preparar cardápios, eventos e operadores, mas não pode publicar eventos.</w:t>
+        <w:t xml:space="preserve">Enquanto aguarda a aprovação do administrador, já pode acessar o painel e preparar cardápios, eventos e operadores, mas só pode publicar eventos depois de aprovado e com a conta Mercado Pago conectada.</w:t>
       </w:r>
     </w:p>
     <w:p>
@@ -2163,7 +2159,7 @@
         <w:jc w:val="both"/>
       </w:pPr>
       <w:r>
-        <w:t xml:space="preserve">Após o evento, consulta os estornos realizados, com o operador responsável, os itens e o motivo de cada um.</w:t>
+        <w:t xml:space="preserve">Após o evento, consulta os pedidos realizados, incluindo os itens marcados pelos operadores como não entregues.</w:t>
       </w:r>
     </w:p>
     <w:p/>
@@ -2616,7 +2612,7 @@
         <w:jc w:val="both"/>
       </w:pPr>
       <w:r>
-        <w:t xml:space="preserve">Estorno rastreável: quando um item acaba, o operador registra o estorno no próprio aplicativo. O valor sempre retorna ao meio de pagamento original do consumidor, nunca ao operador, e cada estorno é registrado com o identificador do operador, os itens, o valor e o motivo, disponível para auditoria no painel do estabelecimento.</w:t>
+        <w:t xml:space="preserve">Itens não entregues registrados: quando um item acaba, o operador o indica na confirmação da entrega. O pedido guarda quais itens não foram entregues, com o operador e o horário, o que permite ao estabelecimento comprovar o ocorrido em caso de reclamação ou contestação da compra. A devolução do valor, quando houver, é combinada diretamente entre o estabelecimento e o consumidor.</w:t>
       </w:r>
     </w:p>
     <w:p>
@@ -2646,7 +2642,7 @@
         <w:jc w:val="both"/>
       </w:pPr>
       <w:r>
-        <w:t xml:space="preserve">Código de acesso do operador protegido: o código possui seis caracteres alfanuméricos, sem caracteres que se confundem, como 0 e O, o que resulta em cerca de um bilhão de combinações. O backend limita as tentativas de login a cinco por endereço IP, com bloqueio temporário, e armazena apenas o hash do código, nunca o código em texto puro. No MVP, a contagem de tentativas fica na memória do servidor, o que funciona com a instância única do backend na Railway. Essa é uma limitação conhecida: quando o backend passar a rodar em mais de uma instância, a contagem deve ir para o banco de dados ou para um cache compartilhado.</w:t>
+        <w:t xml:space="preserve">Código de acesso do operador protegido: o código possui seis caracteres alfanuméricos, sem caracteres que se confundem, como 0 e O, o que resulta em cerca de um bilhão de combinações. O backend limita as tentativas de login por endereço de rede e armazena apenas o hash do código, nunca o código em texto puro. No MVP, com uma única instância do backend, o controle de tentativas fica em memória; com várias instâncias, ele deve passar para o banco ou para um cache compartilhado.</w:t>
       </w:r>
     </w:p>
     <w:p>
@@ -2662,6 +2658,21 @@
       </w:pPr>
       <w:r>
         <w:t xml:space="preserve">QR Code do comprovante válido em todos os balcões: o QR Code gerado no comprovante do consumidor é reconhecido por qualquer operador do mesmo evento, independentemente do balcão em que está alocado.</w:t>
+      </w:r>
+    </w:p>
+    <w:p>
+      <w:pPr>
+        <w:pStyle w:val="PargrafodaLista"/>
+        <w:numPr>
+          <w:ilvl w:val="0"/>
+          <w:numId w:val="2"/>
+        </w:numPr>
+        <w:spacing w:line="360" w:lineRule="auto"/>
+        <w:ind w:firstLine="706"/>
+        <w:jc w:val="both"/>
+      </w:pPr>
+      <w:r>
+        <w:t xml:space="preserve">Tokens do Mercado Pago protegidos: os tokens de acesso que permitem cobrar em nome de cada estabelecimento são armazenados criptografados no banco de dados, com uma chave mantida apenas nas variáveis de ambiente do backend, e nunca são enviados aos aplicativos.</w:t>
       </w:r>
     </w:p>
     <w:p/>
@@ -3058,7 +3069,7 @@
               <w:rPr>
                 <w:sz w:val="18"/>
               </w:rPr>
-              <w:t xml:space="preserve">Scanner de QR Code, atendimento, confirmação de entrega e estorno de itens</w:t>
+              <w:t xml:space="preserve">Scanner de QR Code, atendimento e confirmação de entrega</w:t>
             </w:r>
           </w:p>
         </w:tc>
@@ -3121,7 +3132,7 @@
               <w:rPr>
                 <w:sz w:val="18"/>
               </w:rPr>
-              <w:t xml:space="preserve">Regras de negócio, validação de pedidos, autenticação dos operadores e integração com o Pagar.me</w:t>
+              <w:t xml:space="preserve">Regras de negócio, validação de pedidos, autenticação dos operadores e integração com o Mercado Pago</w:t>
             </w:r>
           </w:p>
         </w:tc>
@@ -3543,7 +3554,7 @@
               <w:rPr>
                 <w:sz w:val="18"/>
               </w:rPr>
-              <w:t xml:space="preserve">Pagar.me</w:t>
+              <w:t xml:space="preserve">Mercado Pago</w:t>
             </w:r>
           </w:p>
         </w:tc>
@@ -3562,7 +3573,7 @@
               <w:rPr>
                 <w:sz w:val="18"/>
               </w:rPr>
-              <w:t xml:space="preserve">Processamento de pagamentos, split automático e estornos</w:t>
+              <w:t xml:space="preserve">Processamento de Pix e cartão, conexão das contas dos estabelecimentos (OAuth) e split automático</w:t>
             </w:r>
           </w:p>
         </w:tc>
@@ -4036,7 +4047,7 @@
         <w:jc w:val="both"/>
       </w:pPr>
       <w:r>
-        <w:t xml:space="preserve">Todas as operações que gravam dados, como criar eventos, cardápios e pedidos, iniciar pagamentos, ler QR Codes e registrar estornos, passam pelo backend, que concentra as regras de negócio e acessa o banco por meio do Prisma. Os aplicativos acessam o Supabase diretamente em apenas dois casos: a autenticação pelo Supabase Auth e o recebimento de atualizações em tempo real pelo Supabase Realtime. As políticas de segurança por linha (RLS) ficam ativas em todas as tabelas e liberam somente a leitura necessária para o tempo real: o estabelecimento lê os pedidos dos próprios eventos e cada sessão anônima lê apenas os próprios pedidos.</w:t>
+        <w:t xml:space="preserve">Todas as operações que gravam dados, como criar eventos, cardápios e pedidos, iniciar pagamentos e ler QR Codes, passam pelo backend, que concentra as regras de negócio e acessa o banco por meio do Prisma. Os aplicativos acessam o Supabase diretamente em apenas dois casos: a autenticação pelo Supabase Auth e o recebimento de atualizações em tempo real pelo Supabase Realtime. A Data API do Supabase fica desativada. As políticas de segurança por linha (RLS) ficam ativas em todas as tabelas e liberam somente a leitura necessária para o tempo real: o estabelecimento lê os pedidos dos próprios eventos e cada sessão anônima lê apenas os próprios pedidos. Como as sessões anônimas usam o mesmo papel dos usuários autenticados no Supabase, toda política confere a posse do dado pelo identificador do usuário, e não apenas o fato de ele estar autenticado.</w:t>
       </w:r>
     </w:p>
     <w:p/>
@@ -4060,7 +4071,7 @@
         <w:jc w:val="both"/>
       </w:pPr>
       <w:r>
-        <w:t xml:space="preserve">O processamento de pagamentos é realizado pelo Pagar.me, gateway escolhido por sua robustez, suporte nativo ao Pix e pela funcionalidade de split automático, que distribui os valores entre os recebedores sem necessidade de nenhuma intervenção manual. Como a confirmação do Pix é assíncrona, o pedido é criado antes do pagamento e só libera o QR Code de retirada depois que o backend recebe a confirmação oficial do Pagar.me. O fluxo completo ocorre da seguinte forma:</w:t>
+        <w:t xml:space="preserve">O processamento de pagamentos é realizado pelo Mercado Pago, escolhido pelas taxas competitivas no Pix e no cartão, adequadas ao ticket baixo dos pedidos em eventos, pelo split de pagamentos e pelo fato de muitos estabelecimentos já possuírem conta Mercado Pago por usarem suas maquininhas. Cada estabelecimento conecta a própria conta Mercado Pago à plataforma por OAuth, e cada pagamento é criado em nome do estabelecimento, de modo que o valor da venda cai diretamente na conta dele. Como a confirmação do Pix é assíncrona, o pedido é criado antes do pagamento e só libera o QR Code de retirada depois que o backend recebe a confirmação oficial do Mercado Pago. O fluxo completo ocorre da seguinte forma:</w:t>
       </w:r>
     </w:p>
     <w:p/>
@@ -4076,7 +4087,7 @@
         <w:jc w:val="both"/>
       </w:pPr>
       <w:r>
-        <w:t xml:space="preserve">O consumidor confirma o carrinho e o backend cria o pedido com o status awaiting_payment, calculando o valor total a partir dos preços do cardápio, e não de valores enviados pelo aplicativo.</w:t>
+        <w:t xml:space="preserve">O estabelecimento conecta sua conta Mercado Pago pelo painel. O backend guarda, criptografados, o token de acesso e o token de renovação, e uma rotina renova o token antes que ele expire. Se a renovação falhar, o estabelecimento é avisado no painel para conectar a conta novamente.</w:t>
       </w:r>
     </w:p>
     <w:p>
@@ -4091,7 +4102,7 @@
         <w:jc w:val="both"/>
       </w:pPr>
       <w:r>
-        <w:t xml:space="preserve">O consumidor escolhe a forma de pagamento e o backend cria uma tentativa de pagamento na tabela payments, acionando a API do Pagar.me com as regras de split. No cartão, os dados são tokenizados diretamente pelo Pagar.me no aplicativo, e o número do cartão nunca passa pelo backend nem é armazenado. No Pix, a cobrança é criada no Pagar.me com expiração no mesmo horário limite do pedido, 15 minutos após a sua criação, de modo que o próprio Pagar.me recusa o pagamento depois do prazo.</w:t>
+        <w:t xml:space="preserve">O consumidor confirma o carrinho e o backend cria o pedido com o status awaiting_payment, calculando o valor total a partir dos preços do cardápio, e não de valores enviados pelo aplicativo.</w:t>
       </w:r>
     </w:p>
     <w:p>
@@ -4106,7 +4117,7 @@
         <w:jc w:val="both"/>
       </w:pPr>
       <w:r>
-        <w:t xml:space="preserve">Cada pedido tem no máximo uma tentativa pendente por vez: enquanto houver uma tentativa com status pending, o backend não cria outra. Se o consumidor quiser trocar do Pix para o cartão, o backend primeiro cancela a cobrança Pix pendente no Pagar.me, marca a tentativa como cancelled e só então cria a tentativa no cartão. Se o cancelamento não for possível porque o Pix acabou de ser pago, a troca é recusada e o pedido segue o fluxo normal de pagamento aprovado.</w:t>
+        <w:t xml:space="preserve">O consumidor escolhe a forma de pagamento e o backend cria uma tentativa na tabela payments, acionando a API do Mercado Pago com o token do estabelecimento e com a comissão da plataforma no campo application_fee, calculada pelo backend como 5% do valor total do pedido. No cartão, os dados são tokenizados pelo formulário seguro do Mercado Pago no aplicativo, e o número do cartão nunca passa pelo backend nem é armazenado.</w:t>
       </w:r>
     </w:p>
     <w:p>
@@ -4121,7 +4132,7 @@
         <w:jc w:val="both"/>
       </w:pPr>
       <w:r>
-        <w:t xml:space="preserve">O Pagar.me informa o resultado ao backend por webhook. Cada aviso recebido é registrado na tabela payment_webhooks; se o mesmo aviso chegar mais de uma vez, ele é identificado e não é processado novamente, o que torna a operação idempotente.</w:t>
+        <w:t xml:space="preserve">Só pode existir uma tentativa pendente por pedido. Se o consumidor quiser trocar do Pix para o cartão, o backend cancela o Pix pendente no Mercado Pago antes de criar a nova tentativa, o que evita cobrança em duplicidade.</w:t>
       </w:r>
     </w:p>
     <w:p>
@@ -4136,7 +4147,7 @@
         <w:jc w:val="both"/>
       </w:pPr>
       <w:r>
-        <w:t xml:space="preserve">Com o pagamento aprovado, o pedido passa para paid e o QR Code de retirada é exibido na tela do consumidor. A confirmação nunca é aceita com base em informação enviada pelo aplicativo.</w:t>
+        <w:t xml:space="preserve">Se o cancelamento do Pix não for possível porque ele acabou de ser pago, a troca para o cartão é recusada e o pedido segue o fluxo normal de pagamento aprovado. Se, mesmo assim, uma segunda tentativa for aprovada para um pedido já pago, ela fica registrada na tabela payments e aparece na busca de pedido do administrador, que orienta o estabelecimento a devolver esse valor ao consumidor pelo próprio Mercado Pago.</w:t>
       </w:r>
     </w:p>
     <w:p>
@@ -4151,7 +4162,7 @@
         <w:jc w:val="both"/>
       </w:pPr>
       <w:r>
-        <w:t xml:space="preserve">Se uma tentativa falhar, como um cartão recusado, apenas a tentativa fica com o status failed. O pedido continua aguardando pagamento e o consumidor pode tentar novamente, com outro cartão ou com Pix. Se nenhuma tentativa for aprovada em 15 minutos, o pedido passa para expired e nenhum valor é cobrado.</w:t>
+        <w:t xml:space="preserve">O Pix é criado no Mercado Pago com validade de 15 minutos, igual ao prazo do pedido. Se nenhuma tentativa for aprovada nesse prazo, o pedido passa para expired e nenhum valor é cobrado.</w:t>
       </w:r>
     </w:p>
     <w:p>
@@ -4166,7 +4177,7 @@
         <w:jc w:val="both"/>
       </w:pPr>
       <w:r>
-        <w:t xml:space="preserve">Estorno automático do sistema: apesar das proteções acima, o backend trata dois casos raros sem intervenção manual. Se chegar a confirmação de um pagamento para um pedido que já está expired, o valor integral dessa tentativa é estornado automaticamente, com o motivo late_payment, e o pedido continua expired. Se uma segunda tentativa for aprovada para um pedido que já foi pago, essa segunda tentativa é estornada automaticamente, com o motivo duplicate_payment, e o pedido mantém o status atual. Esses estornos são registrados na tabela refunds sem operador (operator_id vazio), não têm itens em refund_items e não entram em orders.refunded_amount, que soma apenas os estornos de itens do pedido.</w:t>
+        <w:t xml:space="preserve">O Mercado Pago informa o resultado ao backend por notificação (webhook). O backend confere a assinatura da notificação, consulta o pagamento na API do Mercado Pago para confirmar o status e registra cada aviso na tabela payment_webhooks; avisos repetidos são identificados e não são processados novamente, o que torna a operação idempotente.</w:t>
       </w:r>
     </w:p>
     <w:p>
@@ -4181,7 +4192,7 @@
         <w:jc w:val="both"/>
       </w:pPr>
       <w:r>
-        <w:t xml:space="preserve">No split, a plataforma recebe 5% do valor total do pedido. O estabelecimento recebe os 95% restantes, descontada a taxa do Pagar.me, que varia conforme o meio de pagamento e o contrato. Eventuais chargebacks também ficam a cargo do estabelecimento.</w:t>
+        <w:t xml:space="preserve">Com o pagamento aprovado, o pedido passa para paid e o QR Code de retirada é exibido na tela do consumidor. A confirmação nunca é aceita com base em informação enviada pelo aplicativo. Se um pagamento aprovado chegar para um pedido já expirado, o pedido é reativado como paid enquanto o evento estiver em andamento, e o consumidor recebe o QR Code normalmente.</w:t>
       </w:r>
     </w:p>
     <w:p>
@@ -4196,7 +4207,37 @@
         <w:jc w:val="both"/>
       </w:pPr>
       <w:r>
-        <w:t xml:space="preserve">Quando um item acaba, o operador registra um estorno parcial ou total. O backend solicita o estorno ao Pagar.me, que devolve o valor pelo mesmo meio de pagamento, e o split é desfeito na proporção do valor estornado. Conforme a documentação do Pagar.me, a taxa do Pix e as taxas fixas do cartão não são devolvidas no estorno, e esse custo fica com o estabelecimento.</w:t>
+        <w:t xml:space="preserve">Se uma tentativa falhar, como um cartão recusado, apenas a tentativa fica com o status failed. O pedido continua aguardando pagamento e o consumidor pode tentar novamente, com outro cartão ou com Pix.</w:t>
+      </w:r>
+    </w:p>
+    <w:p>
+      <w:pPr>
+        <w:pStyle w:val="PargrafodaLista"/>
+        <w:numPr>
+          <w:ilvl w:val="0"/>
+          <w:numId w:val="2"/>
+        </w:numPr>
+        <w:spacing w:line="360" w:lineRule="auto"/>
+        <w:ind w:firstLine="706"/>
+        <w:jc w:val="both"/>
+      </w:pPr>
+      <w:r>
+        <w:t xml:space="preserve">No split, o Mercado Pago desconta primeiro a própria taxa da parte do estabelecimento e, em seguida, repassa à plataforma a comissão de 5% sobre o valor total do pedido. O estabelecimento recebe o restante. Eventuais chargebacks também ficam a cargo do estabelecimento.</w:t>
+      </w:r>
+    </w:p>
+    <w:p>
+      <w:pPr>
+        <w:pStyle w:val="PargrafodaLista"/>
+        <w:numPr>
+          <w:ilvl w:val="0"/>
+          <w:numId w:val="2"/>
+        </w:numPr>
+        <w:spacing w:line="360" w:lineRule="auto"/>
+        <w:ind w:firstLine="706"/>
+        <w:jc w:val="both"/>
+      </w:pPr>
+      <w:r>
+        <w:t xml:space="preserve">O MVP não realiza estornos pela plataforma. Quando um item acaba, o operador o indica na confirmação da entrega, o item fica registrado como não entregue no pedido e a troca ou a devolução do valor é combinada diretamente entre o estabelecimento e o consumidor.</w:t>
       </w:r>
     </w:p>
     <w:p/>
@@ -4470,50 +4511,6 @@
               <w:rPr>
                 <w:sz w:val="18"/>
               </w:rPr>
-              <w:t xml:space="preserve">refunded</w:t>
-            </w:r>
-          </w:p>
-        </w:tc>
-        <w:tc>
-          <w:tcPr>
-            <w:tcW w:w="6470" w:type="dxa"/>
-            <w:vAlign w:val="center"/>
-          </w:tcPr>
-          <w:p>
-            <w:pPr>
-              <w:keepLines/>
-              <w:spacing w:line="240" w:lineRule="auto"/>
-              <w:jc w:val="left"/>
-            </w:pPr>
-            <w:r>
-              <w:rPr>
-                <w:sz w:val="18"/>
-              </w:rPr>
-              <w:t xml:space="preserve">Pedido estornado integralmente</w:t>
-            </w:r>
-          </w:p>
-        </w:tc>
-      </w:tr>
-      <w:tr>
-        <w:trPr>
-          <w:cantSplit/>
-          <w:jc w:val="center"/>
-        </w:trPr>
-        <w:tc>
-          <w:tcPr>
-            <w:tcW w:w="2600" w:type="dxa"/>
-            <w:vAlign w:val="center"/>
-          </w:tcPr>
-          <w:p>
-            <w:pPr>
-              <w:keepLines/>
-              <w:spacing w:line="240" w:lineRule="auto"/>
-              <w:jc w:val="center"/>
-            </w:pPr>
-            <w:r>
-              <w:rPr>
-                <w:sz w:val="18"/>
-              </w:rPr>
               <w:t xml:space="preserve">expired</w:t>
             </w:r>
           </w:p>
@@ -4547,7 +4544,7 @@
         <w:jc w:val="both"/>
       </w:pPr>
       <w:r>
-        <w:t xml:space="preserve">As transições possíveis são: awaiting_payment para paid ou expired; paid para in_service; in_service para collected, refunded ou de volta para paid, quando o atendimento é cancelado. Estornos parciais não alteram o status: o valor devolvido é registrado no campo refunded_amount e na tabela refunds, e o pedido segue para collected com os itens restantes. Os estornos automáticos do sistema (late_payment e duplicate_payment) também não alteram o status do pedido.</w:t>
+        <w:t xml:space="preserve">As transições possíveis são: awaiting_payment para paid ou expired; expired para paid, quando um pagamento aprovado chega depois do prazo e o evento ainda está em andamento; paid para in_service; e in_service para collected ou de volta para paid, quando o atendimento é cancelado.</w:t>
       </w:r>
     </w:p>
     <w:p/>
@@ -4571,7 +4568,7 @@
         <w:jc w:val="both"/>
       </w:pPr>
       <w:r>
-        <w:t xml:space="preserve">A API do backend segue o padrão REST, com todas as rotas sob o prefixo /api/v1, dados em formato JSON e validação dos dados de entrada com Zod. As rotas protegidas recebem o token no cabeçalho Authorization. A coluna Acesso indica quem pode chamar cada rota: Público (sem autenticação), Consumidor (sessão anônima), Operador (token emitido pelo backend), Estabelecimento (Supabase Auth, somente para recursos próprios), Admin (Supabase Auth com marcação de administrador) e Pagar.me (assinatura do webhook verificada).</w:t>
+        <w:t xml:space="preserve">A API do backend segue o padrão REST, com todas as rotas sob o prefixo /api/v1, dados em formato JSON e validação dos dados de entrada com Zod. As rotas protegidas recebem o token no cabeçalho Authorization. A coluna Acesso indica quem pode chamar cada rota: Público (sem autenticação), Consumidor (sessão anônima), Operador (token emitido pelo backend), Estabelecimento (Supabase Auth, somente para recursos próprios), Admin (Supabase Auth com marcação de administrador) e Mercado Pago (assinatura da notificação verificada).</w:t>
       </w:r>
     </w:p>
     <w:p/>
@@ -5658,7 +5655,7 @@
               <w:rPr>
                 <w:sz w:val="18"/>
               </w:rPr>
-              <w:t xml:space="preserve">Confirma a entrega (in_service para collected)</w:t>
+              <w:t xml:space="preserve">Confirma a entrega, informando os itens que acabaram (in_service para collected)</w:t>
             </w:r>
           </w:p>
         </w:tc>
@@ -5741,88 +5738,6 @@
                 <w:sz w:val="18"/>
               </w:rPr>
               <w:t xml:space="preserve">Cancela o atendimento (in_service para paid)</w:t>
-            </w:r>
-          </w:p>
-        </w:tc>
-      </w:tr>
-      <w:tr>
-        <w:trPr>
-          <w:cantSplit/>
-          <w:jc w:val="center"/>
-        </w:trPr>
-        <w:tc>
-          <w:tcPr>
-            <w:tcW w:w="1000" w:type="dxa"/>
-            <w:vAlign w:val="center"/>
-          </w:tcPr>
-          <w:p>
-            <w:pPr>
-              <w:keepLines/>
-              <w:spacing w:line="240" w:lineRule="auto"/>
-              <w:jc w:val="center"/>
-            </w:pPr>
-            <w:r>
-              <w:rPr>
-                <w:sz w:val="18"/>
-              </w:rPr>
-              <w:t xml:space="preserve">POST</w:t>
-            </w:r>
-          </w:p>
-        </w:tc>
-        <w:tc>
-          <w:tcPr>
-            <w:tcW w:w="3500" w:type="dxa"/>
-            <w:vAlign w:val="center"/>
-          </w:tcPr>
-          <w:p>
-            <w:pPr>
-              <w:keepLines/>
-              <w:spacing w:line="240" w:lineRule="auto"/>
-              <w:jc w:val="left"/>
-            </w:pPr>
-            <w:r>
-              <w:rPr>
-                <w:sz w:val="18"/>
-              </w:rPr>
-              <w:t xml:space="preserve">/operator/orders/:orderId/refunds</w:t>
-            </w:r>
-          </w:p>
-        </w:tc>
-        <w:tc>
-          <w:tcPr>
-            <w:tcW w:w="1500" w:type="dxa"/>
-            <w:vAlign w:val="center"/>
-          </w:tcPr>
-          <w:p>
-            <w:pPr>
-              <w:keepLines/>
-              <w:spacing w:line="240" w:lineRule="auto"/>
-              <w:jc w:val="center"/>
-            </w:pPr>
-            <w:r>
-              <w:rPr>
-                <w:sz w:val="18"/>
-              </w:rPr>
-              <w:t xml:space="preserve">Operador</w:t>
-            </w:r>
-          </w:p>
-        </w:tc>
-        <w:tc>
-          <w:tcPr>
-            <w:tcW w:w="3070" w:type="dxa"/>
-            <w:vAlign w:val="center"/>
-          </w:tcPr>
-          <w:p>
-            <w:pPr>
-              <w:keepLines/>
-              <w:spacing w:line="240" w:lineRule="auto"/>
-              <w:jc w:val="left"/>
-            </w:pPr>
-            <w:r>
-              <w:rPr>
-                <w:sz w:val="18"/>
-              </w:rPr>
-              <w:t xml:space="preserve">Estorna itens esgotados ou o pedido inteiro</w:t>
             </w:r>
           </w:p>
         </w:tc>
@@ -6121,7 +6036,7 @@
               <w:rPr>
                 <w:sz w:val="18"/>
               </w:rPr>
-              <w:t xml:space="preserve">Completa o cadastro: nome, slug, CPF/CNPJ e dados bancários</w:t>
+              <w:t xml:space="preserve">Completa o cadastro: nome, slug e CPF/CNPJ</w:t>
             </w:r>
           </w:p>
         </w:tc>
@@ -6411,7 +6326,7 @@
               <w:rPr>
                 <w:sz w:val="18"/>
               </w:rPr>
-              <w:t xml:space="preserve">/menus</w:t>
+              <w:t xml:space="preserve">/establishments/me/mercadopago/connect</w:t>
             </w:r>
           </w:p>
         </w:tc>
@@ -6449,7 +6364,7 @@
               <w:rPr>
                 <w:sz w:val="18"/>
               </w:rPr>
-              <w:t xml:space="preserve">Lista os cardápios reutilizáveis</w:t>
+              <w:t xml:space="preserve">Gera o link de autorização do Mercado Pago (OAuth)</w:t>
             </w:r>
           </w:p>
         </w:tc>
@@ -6474,7 +6389,7 @@
               <w:rPr>
                 <w:sz w:val="18"/>
               </w:rPr>
-              <w:t xml:space="preserve">POST</w:t>
+              <w:t xml:space="preserve">GET</w:t>
             </w:r>
           </w:p>
         </w:tc>
@@ -6493,7 +6408,7 @@
               <w:rPr>
                 <w:sz w:val="18"/>
               </w:rPr>
-              <w:t xml:space="preserve">/menus</w:t>
+              <w:t xml:space="preserve">/oauth/mercadopago/callback</w:t>
             </w:r>
           </w:p>
         </w:tc>
@@ -6512,7 +6427,7 @@
               <w:rPr>
                 <w:sz w:val="18"/>
               </w:rPr>
-              <w:t xml:space="preserve">Estabelecimento</w:t>
+              <w:t xml:space="preserve">Público</w:t>
             </w:r>
           </w:p>
         </w:tc>
@@ -6531,7 +6446,7 @@
               <w:rPr>
                 <w:sz w:val="18"/>
               </w:rPr>
-              <w:t xml:space="preserve">Cria um cardápio</w:t>
+              <w:t xml:space="preserve">Retorno do Mercado Pago; valida o state assinado e guarda os tokens</w:t>
             </w:r>
           </w:p>
         </w:tc>
@@ -6556,7 +6471,7 @@
               <w:rPr>
                 <w:sz w:val="18"/>
               </w:rPr>
-              <w:t xml:space="preserve">PATCH</w:t>
+              <w:t xml:space="preserve">DELETE</w:t>
             </w:r>
           </w:p>
         </w:tc>
@@ -6575,7 +6490,7 @@
               <w:rPr>
                 <w:sz w:val="18"/>
               </w:rPr>
-              <w:t xml:space="preserve">/menus/:menuId</w:t>
+              <w:t xml:space="preserve">/establishments/me/mercadopago</w:t>
             </w:r>
           </w:p>
         </w:tc>
@@ -6613,7 +6528,7 @@
               <w:rPr>
                 <w:sz w:val="18"/>
               </w:rPr>
-              <w:t xml:space="preserve">Renomeia um cardápio</w:t>
+              <w:t xml:space="preserve">Desconecta a conta Mercado Pago</w:t>
             </w:r>
           </w:p>
         </w:tc>
@@ -6638,7 +6553,7 @@
               <w:rPr>
                 <w:sz w:val="18"/>
               </w:rPr>
-              <w:t xml:space="preserve">DELETE</w:t>
+              <w:t xml:space="preserve">GET</w:t>
             </w:r>
           </w:p>
         </w:tc>
@@ -6657,7 +6572,7 @@
               <w:rPr>
                 <w:sz w:val="18"/>
               </w:rPr>
-              <w:t xml:space="preserve">/menus/:menuId</w:t>
+              <w:t xml:space="preserve">/menus</w:t>
             </w:r>
           </w:p>
         </w:tc>
@@ -6695,7 +6610,7 @@
               <w:rPr>
                 <w:sz w:val="18"/>
               </w:rPr>
-              <w:t xml:space="preserve">Exclui um cardápio sem afetar eventos já criados</w:t>
+              <w:t xml:space="preserve">Lista os cardápios reutilizáveis</w:t>
             </w:r>
           </w:p>
         </w:tc>
@@ -6739,7 +6654,7 @@
               <w:rPr>
                 <w:sz w:val="18"/>
               </w:rPr>
-              <w:t xml:space="preserve">/menus/:menuId/items</w:t>
+              <w:t xml:space="preserve">/menus</w:t>
             </w:r>
           </w:p>
         </w:tc>
@@ -6777,7 +6692,7 @@
               <w:rPr>
                 <w:sz w:val="18"/>
               </w:rPr>
-              <w:t xml:space="preserve">Adiciona item ao cardápio</w:t>
+              <w:t xml:space="preserve">Cria um cardápio</w:t>
             </w:r>
           </w:p>
         </w:tc>
@@ -6821,7 +6736,7 @@
               <w:rPr>
                 <w:sz w:val="18"/>
               </w:rPr>
-              <w:t xml:space="preserve">/menus/:menuId/items/:itemId</w:t>
+              <w:t xml:space="preserve">/menus/:menuId</w:t>
             </w:r>
           </w:p>
         </w:tc>
@@ -6859,7 +6774,7 @@
               <w:rPr>
                 <w:sz w:val="18"/>
               </w:rPr>
-              <w:t xml:space="preserve">Altera item do cardápio</w:t>
+              <w:t xml:space="preserve">Renomeia um cardápio</w:t>
             </w:r>
           </w:p>
         </w:tc>
@@ -6903,7 +6818,7 @@
               <w:rPr>
                 <w:sz w:val="18"/>
               </w:rPr>
-              <w:t xml:space="preserve">/menus/:menuId/items/:itemId</w:t>
+              <w:t xml:space="preserve">/menus/:menuId</w:t>
             </w:r>
           </w:p>
         </w:tc>
@@ -6941,7 +6856,7 @@
               <w:rPr>
                 <w:sz w:val="18"/>
               </w:rPr>
-              <w:t xml:space="preserve">Remove item do cardápio</w:t>
+              <w:t xml:space="preserve">Exclui um cardápio sem afetar eventos já criados</w:t>
             </w:r>
           </w:p>
         </w:tc>
@@ -6966,7 +6881,7 @@
               <w:rPr>
                 <w:sz w:val="18"/>
               </w:rPr>
-              <w:t xml:space="preserve">GET</w:t>
+              <w:t xml:space="preserve">POST</w:t>
             </w:r>
           </w:p>
         </w:tc>
@@ -6985,7 +6900,7 @@
               <w:rPr>
                 <w:sz w:val="18"/>
               </w:rPr>
-              <w:t xml:space="preserve">/events</w:t>
+              <w:t xml:space="preserve">/menus/:menuId/items</w:t>
             </w:r>
           </w:p>
         </w:tc>
@@ -7023,7 +6938,7 @@
               <w:rPr>
                 <w:sz w:val="18"/>
               </w:rPr>
-              <w:t xml:space="preserve">Lista os eventos com status calculado</w:t>
+              <w:t xml:space="preserve">Adiciona item ao cardápio</w:t>
             </w:r>
           </w:p>
         </w:tc>
@@ -7048,7 +6963,7 @@
               <w:rPr>
                 <w:sz w:val="18"/>
               </w:rPr>
-              <w:t xml:space="preserve">POST</w:t>
+              <w:t xml:space="preserve">PATCH</w:t>
             </w:r>
           </w:p>
         </w:tc>
@@ -7067,7 +6982,7 @@
               <w:rPr>
                 <w:sz w:val="18"/>
               </w:rPr>
-              <w:t xml:space="preserve">/events</w:t>
+              <w:t xml:space="preserve">/menus/:menuId/items/:itemId</w:t>
             </w:r>
           </w:p>
         </w:tc>
@@ -7105,7 +7020,7 @@
               <w:rPr>
                 <w:sz w:val="18"/>
               </w:rPr>
-              <w:t xml:space="preserve">Cria evento e copia os itens do cardápio escolhido</w:t>
+              <w:t xml:space="preserve">Altera item do cardápio</w:t>
             </w:r>
           </w:p>
         </w:tc>
@@ -7130,7 +7045,7 @@
               <w:rPr>
                 <w:sz w:val="18"/>
               </w:rPr>
-              <w:t xml:space="preserve">PATCH</w:t>
+              <w:t xml:space="preserve">DELETE</w:t>
             </w:r>
           </w:p>
         </w:tc>
@@ -7149,7 +7064,7 @@
               <w:rPr>
                 <w:sz w:val="18"/>
               </w:rPr>
-              <w:t xml:space="preserve">/events/:eventId</w:t>
+              <w:t xml:space="preserve">/menus/:menuId/items/:itemId</w:t>
             </w:r>
           </w:p>
         </w:tc>
@@ -7187,7 +7102,7 @@
               <w:rPr>
                 <w:sz w:val="18"/>
               </w:rPr>
-              <w:t xml:space="preserve">Altera nome e horários do evento</w:t>
+              <w:t xml:space="preserve">Remove item do cardápio</w:t>
             </w:r>
           </w:p>
         </w:tc>
@@ -7212,7 +7127,7 @@
               <w:rPr>
                 <w:sz w:val="18"/>
               </w:rPr>
-              <w:t xml:space="preserve">POST</w:t>
+              <w:t xml:space="preserve">GET</w:t>
             </w:r>
           </w:p>
         </w:tc>
@@ -7231,7 +7146,7 @@
               <w:rPr>
                 <w:sz w:val="18"/>
               </w:rPr>
-              <w:t xml:space="preserve">/events/:eventId/publish</w:t>
+              <w:t xml:space="preserve">/events</w:t>
             </w:r>
           </w:p>
         </w:tc>
@@ -7269,7 +7184,7 @@
               <w:rPr>
                 <w:sz w:val="18"/>
               </w:rPr>
-              <w:t xml:space="preserve">Publica o evento; exige cadastro aprovado</w:t>
+              <w:t xml:space="preserve">Lista os eventos com status calculado</w:t>
             </w:r>
           </w:p>
         </w:tc>
@@ -7313,7 +7228,7 @@
               <w:rPr>
                 <w:sz w:val="18"/>
               </w:rPr>
-              <w:t xml:space="preserve">/events/:eventId/menu-items</w:t>
+              <w:t xml:space="preserve">/events</w:t>
             </w:r>
           </w:p>
         </w:tc>
@@ -7351,7 +7266,7 @@
               <w:rPr>
                 <w:sz w:val="18"/>
               </w:rPr>
-              <w:t xml:space="preserve">Adiciona item apenas a este evento</w:t>
+              <w:t xml:space="preserve">Cria evento e copia os itens do cardápio escolhido</w:t>
             </w:r>
           </w:p>
         </w:tc>
@@ -7395,7 +7310,7 @@
               <w:rPr>
                 <w:sz w:val="18"/>
               </w:rPr>
-              <w:t xml:space="preserve">/events/:eventId/menu-items/:itemId</w:t>
+              <w:t xml:space="preserve">/events/:eventId</w:t>
             </w:r>
           </w:p>
         </w:tc>
@@ -7433,7 +7348,7 @@
               <w:rPr>
                 <w:sz w:val="18"/>
               </w:rPr>
-              <w:t xml:space="preserve">Altera item do evento, inclusive disponível ou esgotado</w:t>
+              <w:t xml:space="preserve">Altera nome e horários do evento</w:t>
             </w:r>
           </w:p>
         </w:tc>
@@ -7458,7 +7373,7 @@
               <w:rPr>
                 <w:sz w:val="18"/>
               </w:rPr>
-              <w:t xml:space="preserve">DELETE</w:t>
+              <w:t xml:space="preserve">POST</w:t>
             </w:r>
           </w:p>
         </w:tc>
@@ -7477,7 +7392,7 @@
               <w:rPr>
                 <w:sz w:val="18"/>
               </w:rPr>
-              <w:t xml:space="preserve">/events/:eventId/menu-items/:itemId</w:t>
+              <w:t xml:space="preserve">/events/:eventId/publish</w:t>
             </w:r>
           </w:p>
         </w:tc>
@@ -7515,7 +7430,7 @@
               <w:rPr>
                 <w:sz w:val="18"/>
               </w:rPr>
-              <w:t xml:space="preserve">Remove item do evento</w:t>
+              <w:t xml:space="preserve">Publica o evento; exige cadastro aprovado e conta Mercado Pago conectada</w:t>
             </w:r>
           </w:p>
         </w:tc>
@@ -7540,7 +7455,7 @@
               <w:rPr>
                 <w:sz w:val="18"/>
               </w:rPr>
-              <w:t xml:space="preserve">GET</w:t>
+              <w:t xml:space="preserve">POST</w:t>
             </w:r>
           </w:p>
         </w:tc>
@@ -7559,7 +7474,7 @@
               <w:rPr>
                 <w:sz w:val="18"/>
               </w:rPr>
-              <w:t xml:space="preserve">/events/:eventId/operators</w:t>
+              <w:t xml:space="preserve">/events/:eventId/menu-items</w:t>
             </w:r>
           </w:p>
         </w:tc>
@@ -7597,7 +7512,7 @@
               <w:rPr>
                 <w:sz w:val="18"/>
               </w:rPr>
-              <w:t xml:space="preserve">Lista os operadores do evento</w:t>
+              <w:t xml:space="preserve">Adiciona item apenas a este evento</w:t>
             </w:r>
           </w:p>
         </w:tc>
@@ -7622,7 +7537,7 @@
               <w:rPr>
                 <w:sz w:val="18"/>
               </w:rPr>
-              <w:t xml:space="preserve">POST</w:t>
+              <w:t xml:space="preserve">PATCH</w:t>
             </w:r>
           </w:p>
         </w:tc>
@@ -7641,7 +7556,7 @@
               <w:rPr>
                 <w:sz w:val="18"/>
               </w:rPr>
-              <w:t xml:space="preserve">/events/:eventId/operators</w:t>
+              <w:t xml:space="preserve">/events/:eventId/menu-items/:itemId</w:t>
             </w:r>
           </w:p>
         </w:tc>
@@ -7679,7 +7594,7 @@
               <w:rPr>
                 <w:sz w:val="18"/>
               </w:rPr>
-              <w:t xml:space="preserve">Cadastra operador e retorna o código uma única vez</w:t>
+              <w:t xml:space="preserve">Altera item do evento, inclusive disponível ou esgotado</w:t>
             </w:r>
           </w:p>
         </w:tc>
@@ -7704,7 +7619,7 @@
               <w:rPr>
                 <w:sz w:val="18"/>
               </w:rPr>
-              <w:t xml:space="preserve">PATCH</w:t>
+              <w:t xml:space="preserve">DELETE</w:t>
             </w:r>
           </w:p>
         </w:tc>
@@ -7723,7 +7638,7 @@
               <w:rPr>
                 <w:sz w:val="18"/>
               </w:rPr>
-              <w:t xml:space="preserve">/events/:eventId/operators/:operatorId</w:t>
+              <w:t xml:space="preserve">/events/:eventId/menu-items/:itemId</w:t>
             </w:r>
           </w:p>
         </w:tc>
@@ -7761,7 +7676,7 @@
               <w:rPr>
                 <w:sz w:val="18"/>
               </w:rPr>
-              <w:t xml:space="preserve">Altera balcão ou ativa e desativa o acesso</w:t>
+              <w:t xml:space="preserve">Remove item do evento</w:t>
             </w:r>
           </w:p>
         </w:tc>
@@ -7786,7 +7701,7 @@
               <w:rPr>
                 <w:sz w:val="18"/>
               </w:rPr>
-              <w:t xml:space="preserve">POST</w:t>
+              <w:t xml:space="preserve">GET</w:t>
             </w:r>
           </w:p>
         </w:tc>
@@ -7805,7 +7720,7 @@
               <w:rPr>
                 <w:sz w:val="18"/>
               </w:rPr>
-              <w:t xml:space="preserve">/events/:eventId/operators/:operatorId/code</w:t>
+              <w:t xml:space="preserve">/events/:eventId/operators</w:t>
             </w:r>
           </w:p>
         </w:tc>
@@ -7843,7 +7758,7 @@
               <w:rPr>
                 <w:sz w:val="18"/>
               </w:rPr>
-              <w:t xml:space="preserve">Gera novo código e invalida o anterior</w:t>
+              <w:t xml:space="preserve">Lista os operadores do evento</w:t>
             </w:r>
           </w:p>
         </w:tc>
@@ -7868,7 +7783,7 @@
               <w:rPr>
                 <w:sz w:val="18"/>
               </w:rPr>
-              <w:t xml:space="preserve">GET</w:t>
+              <w:t xml:space="preserve">POST</w:t>
             </w:r>
           </w:p>
         </w:tc>
@@ -7887,7 +7802,7 @@
               <w:rPr>
                 <w:sz w:val="18"/>
               </w:rPr>
-              <w:t xml:space="preserve">/events/:eventId/orders</w:t>
+              <w:t xml:space="preserve">/events/:eventId/operators</w:t>
             </w:r>
           </w:p>
         </w:tc>
@@ -7925,7 +7840,7 @@
               <w:rPr>
                 <w:sz w:val="18"/>
               </w:rPr>
-              <w:t xml:space="preserve">Pedidos do evento; atualizações chegam pelo Realtime</w:t>
+              <w:t xml:space="preserve">Cadastra operador e retorna o código uma única vez</w:t>
             </w:r>
           </w:p>
         </w:tc>
@@ -7950,7 +7865,7 @@
               <w:rPr>
                 <w:sz w:val="18"/>
               </w:rPr>
-              <w:t xml:space="preserve">GET</w:t>
+              <w:t xml:space="preserve">PATCH</w:t>
             </w:r>
           </w:p>
         </w:tc>
@@ -7969,7 +7884,7 @@
               <w:rPr>
                 <w:sz w:val="18"/>
               </w:rPr>
-              <w:t xml:space="preserve">/events/:eventId/dashboard</w:t>
+              <w:t xml:space="preserve">/events/:eventId/operators/:operatorId</w:t>
             </w:r>
           </w:p>
         </w:tc>
@@ -8007,7 +7922,7 @@
               <w:rPr>
                 <w:sz w:val="18"/>
               </w:rPr>
-              <w:t xml:space="preserve">Faturamento, pedidos, ticket médio e itens mais vendidos</w:t>
+              <w:t xml:space="preserve">Altera balcão ou ativa e desativa o acesso</w:t>
             </w:r>
           </w:p>
         </w:tc>
@@ -8032,6 +7947,88 @@
               <w:rPr>
                 <w:sz w:val="18"/>
               </w:rPr>
+              <w:t xml:space="preserve">POST</w:t>
+            </w:r>
+          </w:p>
+        </w:tc>
+        <w:tc>
+          <w:tcPr>
+            <w:tcW w:w="3500" w:type="dxa"/>
+            <w:vAlign w:val="center"/>
+          </w:tcPr>
+          <w:p>
+            <w:pPr>
+              <w:keepLines/>
+              <w:spacing w:line="240" w:lineRule="auto"/>
+              <w:jc w:val="left"/>
+            </w:pPr>
+            <w:r>
+              <w:rPr>
+                <w:sz w:val="18"/>
+              </w:rPr>
+              <w:t xml:space="preserve">/events/:eventId/operators/:operatorId/code</w:t>
+            </w:r>
+          </w:p>
+        </w:tc>
+        <w:tc>
+          <w:tcPr>
+            <w:tcW w:w="1500" w:type="dxa"/>
+            <w:vAlign w:val="center"/>
+          </w:tcPr>
+          <w:p>
+            <w:pPr>
+              <w:keepLines/>
+              <w:spacing w:line="240" w:lineRule="auto"/>
+              <w:jc w:val="center"/>
+            </w:pPr>
+            <w:r>
+              <w:rPr>
+                <w:sz w:val="18"/>
+              </w:rPr>
+              <w:t xml:space="preserve">Estabelecimento</w:t>
+            </w:r>
+          </w:p>
+        </w:tc>
+        <w:tc>
+          <w:tcPr>
+            <w:tcW w:w="3070" w:type="dxa"/>
+            <w:vAlign w:val="center"/>
+          </w:tcPr>
+          <w:p>
+            <w:pPr>
+              <w:keepLines/>
+              <w:spacing w:line="240" w:lineRule="auto"/>
+              <w:jc w:val="left"/>
+            </w:pPr>
+            <w:r>
+              <w:rPr>
+                <w:sz w:val="18"/>
+              </w:rPr>
+              <w:t xml:space="preserve">Gera novo código e invalida o anterior</w:t>
+            </w:r>
+          </w:p>
+        </w:tc>
+      </w:tr>
+      <w:tr>
+        <w:trPr>
+          <w:cantSplit/>
+          <w:jc w:val="center"/>
+        </w:trPr>
+        <w:tc>
+          <w:tcPr>
+            <w:tcW w:w="1000" w:type="dxa"/>
+            <w:vAlign w:val="center"/>
+          </w:tcPr>
+          <w:p>
+            <w:pPr>
+              <w:keepLines/>
+              <w:spacing w:line="240" w:lineRule="auto"/>
+              <w:jc w:val="center"/>
+            </w:pPr>
+            <w:r>
+              <w:rPr>
+                <w:sz w:val="18"/>
+              </w:rPr>
               <w:t xml:space="preserve">GET</w:t>
             </w:r>
           </w:p>
@@ -8051,7 +8048,7 @@
               <w:rPr>
                 <w:sz w:val="18"/>
               </w:rPr>
-              <w:t xml:space="preserve">/events/:eventId/refunds</w:t>
+              <w:t xml:space="preserve">/events/:eventId/orders</w:t>
             </w:r>
           </w:p>
         </w:tc>
@@ -8089,7 +8086,89 @@
               <w:rPr>
                 <w:sz w:val="18"/>
               </w:rPr>
-              <w:t xml:space="preserve">Estornos do evento, para auditoria</w:t>
+              <w:t xml:space="preserve">Pedidos do evento; atualizações chegam pelo Realtime</w:t>
+            </w:r>
+          </w:p>
+        </w:tc>
+      </w:tr>
+      <w:tr>
+        <w:trPr>
+          <w:cantSplit/>
+          <w:jc w:val="center"/>
+        </w:trPr>
+        <w:tc>
+          <w:tcPr>
+            <w:tcW w:w="1000" w:type="dxa"/>
+            <w:vAlign w:val="center"/>
+          </w:tcPr>
+          <w:p>
+            <w:pPr>
+              <w:keepLines/>
+              <w:spacing w:line="240" w:lineRule="auto"/>
+              <w:jc w:val="center"/>
+            </w:pPr>
+            <w:r>
+              <w:rPr>
+                <w:sz w:val="18"/>
+              </w:rPr>
+              <w:t xml:space="preserve">GET</w:t>
+            </w:r>
+          </w:p>
+        </w:tc>
+        <w:tc>
+          <w:tcPr>
+            <w:tcW w:w="3500" w:type="dxa"/>
+            <w:vAlign w:val="center"/>
+          </w:tcPr>
+          <w:p>
+            <w:pPr>
+              <w:keepLines/>
+              <w:spacing w:line="240" w:lineRule="auto"/>
+              <w:jc w:val="left"/>
+            </w:pPr>
+            <w:r>
+              <w:rPr>
+                <w:sz w:val="18"/>
+              </w:rPr>
+              <w:t xml:space="preserve">/events/:eventId/dashboard</w:t>
+            </w:r>
+          </w:p>
+        </w:tc>
+        <w:tc>
+          <w:tcPr>
+            <w:tcW w:w="1500" w:type="dxa"/>
+            <w:vAlign w:val="center"/>
+          </w:tcPr>
+          <w:p>
+            <w:pPr>
+              <w:keepLines/>
+              <w:spacing w:line="240" w:lineRule="auto"/>
+              <w:jc w:val="center"/>
+            </w:pPr>
+            <w:r>
+              <w:rPr>
+                <w:sz w:val="18"/>
+              </w:rPr>
+              <w:t xml:space="preserve">Estabelecimento</w:t>
+            </w:r>
+          </w:p>
+        </w:tc>
+        <w:tc>
+          <w:tcPr>
+            <w:tcW w:w="3070" w:type="dxa"/>
+            <w:vAlign w:val="center"/>
+          </w:tcPr>
+          <w:p>
+            <w:pPr>
+              <w:keepLines/>
+              <w:spacing w:line="240" w:lineRule="auto"/>
+              <w:jc w:val="left"/>
+            </w:pPr>
+            <w:r>
+              <w:rPr>
+                <w:sz w:val="18"/>
+              </w:rPr>
+              <w:t xml:space="preserve">Faturamento, pedidos, ticket médio e itens mais vendidos</w:t>
             </w:r>
           </w:p>
         </w:tc>
@@ -8388,7 +8467,7 @@
               <w:rPr>
                 <w:sz w:val="18"/>
               </w:rPr>
-              <w:t xml:space="preserve">Faturamento do mês: vendas, transacionado, estornos e receita, por dia e por estabelecimento</w:t>
+              <w:t xml:space="preserve">Faturamento do mês: vendas, transacionado e receita, por dia e por estabelecimento</w:t>
             </w:r>
           </w:p>
         </w:tc>
@@ -8470,7 +8549,7 @@
               <w:rPr>
                 <w:sz w:val="18"/>
               </w:rPr>
-              <w:t xml:space="preserve">Busca pedidos pelo código em todos os eventos, com pagamentos, estornos e histórico</w:t>
+              <w:t xml:space="preserve">Busca pedidos pelo código em todos os eventos, com pagamentos e histórico</w:t>
             </w:r>
           </w:p>
         </w:tc>
@@ -8977,7 +9056,7 @@
               <w:rPr>
                 <w:sz w:val="18"/>
               </w:rPr>
-              <w:t xml:space="preserve">/webhooks/pagarme</w:t>
+              <w:t xml:space="preserve">/webhooks/mercadopago</w:t>
             </w:r>
           </w:p>
         </w:tc>
@@ -8996,7 +9075,7 @@
               <w:rPr>
                 <w:sz w:val="18"/>
               </w:rPr>
-              <w:t xml:space="preserve">Pagar.me</w:t>
+              <w:t xml:space="preserve">Mercado Pago</w:t>
             </w:r>
           </w:p>
         </w:tc>
@@ -9015,7 +9094,7 @@
               <w:rPr>
                 <w:sz w:val="18"/>
               </w:rPr>
-              <w:t xml:space="preserve">Recebe avisos de pagamento e estorno de forma idempotente</w:t>
+              <w:t xml:space="preserve">Recebe as notificações de pagamento de forma idempotente</w:t>
             </w:r>
           </w:p>
         </w:tc>
@@ -9136,7 +9215,7 @@
         <w:jc w:val="both"/>
       </w:pPr>
       <w:r>
-        <w:t xml:space="preserve">O banco de dados é composto por doze tabelas. Um estabelecimento possui cardápios reutilizáveis e múltiplos eventos; cada evento possui uma cópia própria dos itens do cardápio, seus operadores e seus pedidos; cada pedido é composto por um ou mais itens e pode ter várias tentativas de pagamento e estornos. As tabelas de usuários ficam no Supabase Auth (auth.users) e não são gerenciadas pelo Prisma: a ligação com elas é criada por uma migration SQL própria. As políticas de segurança por linha (RLS) ficam ativas em todas as tabelas.</w:t>
+        <w:t xml:space="preserve">O banco de dados é composto por dez tabelas. Um estabelecimento possui cardápios reutilizáveis e múltiplos eventos; cada evento possui uma cópia própria dos itens do cardápio, seus operadores e seus pedidos; cada pedido é composto por um ou mais itens e pode ter várias tentativas de pagamento. As tabelas de usuários ficam no Supabase Auth (auth.users) e não são gerenciadas pelo Prisma: a ligação com elas é criada por uma migration SQL própria. As políticas de segurança por linha (RLS) ficam ativas em todas as tabelas.</w:t>
       </w:r>
     </w:p>
     <w:p/>
@@ -9961,7 +10040,7 @@
               <w:rPr>
                 <w:sz w:val="18"/>
               </w:rPr>
-              <w:t xml:space="preserve">pagarme_recipient_id</w:t>
+              <w:t xml:space="preserve">mp_user_id</w:t>
             </w:r>
           </w:p>
         </w:tc>
@@ -10018,7 +10097,335 @@
               <w:rPr>
                 <w:sz w:val="18"/>
               </w:rPr>
-              <w:t xml:space="preserve">Identificador do recebedor no Pagar.me, usado no split. Os dados bancários ficam apenas no Pagar.me</w:t>
+              <w:t xml:space="preserve">Identificador da conta Mercado Pago conectada pelo estabelecimento (user_id retornado no OAuth). Único</w:t>
+            </w:r>
+          </w:p>
+        </w:tc>
+      </w:tr>
+      <w:tr>
+        <w:trPr>
+          <w:cantSplit/>
+          <w:jc w:val="center"/>
+        </w:trPr>
+        <w:tc>
+          <w:tcPr>
+            <w:tcW w:w="1900" w:type="dxa"/>
+            <w:vAlign w:val="center"/>
+          </w:tcPr>
+          <w:p>
+            <w:pPr>
+              <w:keepLines/>
+              <w:spacing w:line="240" w:lineRule="auto"/>
+              <w:jc w:val="center"/>
+            </w:pPr>
+            <w:r>
+              <w:rPr>
+                <w:sz w:val="18"/>
+              </w:rPr>
+              <w:t xml:space="preserve">mp_access_token</w:t>
+            </w:r>
+          </w:p>
+        </w:tc>
+        <w:tc>
+          <w:tcPr>
+            <w:tcW w:w="1400" w:type="dxa"/>
+            <w:vAlign w:val="center"/>
+          </w:tcPr>
+          <w:p>
+            <w:pPr>
+              <w:keepLines/>
+              <w:spacing w:line="240" w:lineRule="auto"/>
+              <w:jc w:val="center"/>
+            </w:pPr>
+            <w:r>
+              <w:rPr>
+                <w:sz w:val="18"/>
+              </w:rPr>
+              <w:t xml:space="preserve">TEXT</w:t>
+            </w:r>
+          </w:p>
+        </w:tc>
+        <w:tc>
+          <w:tcPr>
+            <w:tcW w:w="1100" w:type="dxa"/>
+            <w:vAlign w:val="center"/>
+          </w:tcPr>
+          <w:p>
+            <w:pPr>
+              <w:keepLines/>
+              <w:spacing w:line="240" w:lineRule="auto"/>
+              <w:jc w:val="center"/>
+            </w:pPr>
+            <w:r>
+              <w:rPr>
+                <w:sz w:val="18"/>
+              </w:rPr>
+              <w:t xml:space="preserve">Não</w:t>
+            </w:r>
+          </w:p>
+        </w:tc>
+        <w:tc>
+          <w:tcPr>
+            <w:tcW w:w="4670" w:type="dxa"/>
+            <w:vAlign w:val="center"/>
+          </w:tcPr>
+          <w:p>
+            <w:pPr>
+              <w:keepLines/>
+              <w:spacing w:line="240" w:lineRule="auto"/>
+              <w:jc w:val="center"/>
+            </w:pPr>
+            <w:r>
+              <w:rPr>
+                <w:sz w:val="18"/>
+              </w:rPr>
+              <w:t xml:space="preserve">Token de acesso para criar cobranças em nome do estabelecimento. Armazenado criptografado</w:t>
+            </w:r>
+          </w:p>
+        </w:tc>
+      </w:tr>
+      <w:tr>
+        <w:trPr>
+          <w:cantSplit/>
+          <w:jc w:val="center"/>
+        </w:trPr>
+        <w:tc>
+          <w:tcPr>
+            <w:tcW w:w="1900" w:type="dxa"/>
+            <w:vAlign w:val="center"/>
+          </w:tcPr>
+          <w:p>
+            <w:pPr>
+              <w:keepLines/>
+              <w:spacing w:line="240" w:lineRule="auto"/>
+              <w:jc w:val="center"/>
+            </w:pPr>
+            <w:r>
+              <w:rPr>
+                <w:sz w:val="18"/>
+              </w:rPr>
+              <w:t xml:space="preserve">mp_refresh_token</w:t>
+            </w:r>
+          </w:p>
+        </w:tc>
+        <w:tc>
+          <w:tcPr>
+            <w:tcW w:w="1400" w:type="dxa"/>
+            <w:vAlign w:val="center"/>
+          </w:tcPr>
+          <w:p>
+            <w:pPr>
+              <w:keepLines/>
+              <w:spacing w:line="240" w:lineRule="auto"/>
+              <w:jc w:val="center"/>
+            </w:pPr>
+            <w:r>
+              <w:rPr>
+                <w:sz w:val="18"/>
+              </w:rPr>
+              <w:t xml:space="preserve">TEXT</w:t>
+            </w:r>
+          </w:p>
+        </w:tc>
+        <w:tc>
+          <w:tcPr>
+            <w:tcW w:w="1100" w:type="dxa"/>
+            <w:vAlign w:val="center"/>
+          </w:tcPr>
+          <w:p>
+            <w:pPr>
+              <w:keepLines/>
+              <w:spacing w:line="240" w:lineRule="auto"/>
+              <w:jc w:val="center"/>
+            </w:pPr>
+            <w:r>
+              <w:rPr>
+                <w:sz w:val="18"/>
+              </w:rPr>
+              <w:t xml:space="preserve">Não</w:t>
+            </w:r>
+          </w:p>
+        </w:tc>
+        <w:tc>
+          <w:tcPr>
+            <w:tcW w:w="4670" w:type="dxa"/>
+            <w:vAlign w:val="center"/>
+          </w:tcPr>
+          <w:p>
+            <w:pPr>
+              <w:keepLines/>
+              <w:spacing w:line="240" w:lineRule="auto"/>
+              <w:jc w:val="center"/>
+            </w:pPr>
+            <w:r>
+              <w:rPr>
+                <w:sz w:val="18"/>
+              </w:rPr>
+              <w:t xml:space="preserve">Token usado para renovar o token de acesso. Armazenado criptografado e substituído a cada renovação</w:t>
+            </w:r>
+          </w:p>
+        </w:tc>
+      </w:tr>
+      <w:tr>
+        <w:trPr>
+          <w:cantSplit/>
+          <w:jc w:val="center"/>
+        </w:trPr>
+        <w:tc>
+          <w:tcPr>
+            <w:tcW w:w="1900" w:type="dxa"/>
+            <w:vAlign w:val="center"/>
+          </w:tcPr>
+          <w:p>
+            <w:pPr>
+              <w:keepLines/>
+              <w:spacing w:line="240" w:lineRule="auto"/>
+              <w:jc w:val="center"/>
+            </w:pPr>
+            <w:r>
+              <w:rPr>
+                <w:sz w:val="18"/>
+              </w:rPr>
+              <w:t xml:space="preserve">mp_token_expires_at</w:t>
+            </w:r>
+          </w:p>
+        </w:tc>
+        <w:tc>
+          <w:tcPr>
+            <w:tcW w:w="1400" w:type="dxa"/>
+            <w:vAlign w:val="center"/>
+          </w:tcPr>
+          <w:p>
+            <w:pPr>
+              <w:keepLines/>
+              <w:spacing w:line="240" w:lineRule="auto"/>
+              <w:jc w:val="center"/>
+            </w:pPr>
+            <w:r>
+              <w:rPr>
+                <w:sz w:val="18"/>
+              </w:rPr>
+              <w:t xml:space="preserve">TIMESTAMPTZ</w:t>
+            </w:r>
+          </w:p>
+        </w:tc>
+        <w:tc>
+          <w:tcPr>
+            <w:tcW w:w="1100" w:type="dxa"/>
+            <w:vAlign w:val="center"/>
+          </w:tcPr>
+          <w:p>
+            <w:pPr>
+              <w:keepLines/>
+              <w:spacing w:line="240" w:lineRule="auto"/>
+              <w:jc w:val="center"/>
+            </w:pPr>
+            <w:r>
+              <w:rPr>
+                <w:sz w:val="18"/>
+              </w:rPr>
+              <w:t xml:space="preserve">Não</w:t>
+            </w:r>
+          </w:p>
+        </w:tc>
+        <w:tc>
+          <w:tcPr>
+            <w:tcW w:w="4670" w:type="dxa"/>
+            <w:vAlign w:val="center"/>
+          </w:tcPr>
+          <w:p>
+            <w:pPr>
+              <w:keepLines/>
+              <w:spacing w:line="240" w:lineRule="auto"/>
+              <w:jc w:val="center"/>
+            </w:pPr>
+            <w:r>
+              <w:rPr>
+                <w:sz w:val="18"/>
+              </w:rPr>
+              <w:t xml:space="preserve">Data e hora de expiração do token de acesso, usada pela rotina de renovação</w:t>
+            </w:r>
+          </w:p>
+        </w:tc>
+      </w:tr>
+      <w:tr>
+        <w:trPr>
+          <w:cantSplit/>
+          <w:jc w:val="center"/>
+        </w:trPr>
+        <w:tc>
+          <w:tcPr>
+            <w:tcW w:w="1900" w:type="dxa"/>
+            <w:vAlign w:val="center"/>
+          </w:tcPr>
+          <w:p>
+            <w:pPr>
+              <w:keepLines/>
+              <w:spacing w:line="240" w:lineRule="auto"/>
+              <w:jc w:val="center"/>
+            </w:pPr>
+            <w:r>
+              <w:rPr>
+                <w:sz w:val="18"/>
+              </w:rPr>
+              <w:t xml:space="preserve">mp_connected_at</w:t>
+            </w:r>
+          </w:p>
+        </w:tc>
+        <w:tc>
+          <w:tcPr>
+            <w:tcW w:w="1400" w:type="dxa"/>
+            <w:vAlign w:val="center"/>
+          </w:tcPr>
+          <w:p>
+            <w:pPr>
+              <w:keepLines/>
+              <w:spacing w:line="240" w:lineRule="auto"/>
+              <w:jc w:val="center"/>
+            </w:pPr>
+            <w:r>
+              <w:rPr>
+                <w:sz w:val="18"/>
+              </w:rPr>
+              <w:t xml:space="preserve">TIMESTAMPTZ</w:t>
+            </w:r>
+          </w:p>
+        </w:tc>
+        <w:tc>
+          <w:tcPr>
+            <w:tcW w:w="1100" w:type="dxa"/>
+            <w:vAlign w:val="center"/>
+          </w:tcPr>
+          <w:p>
+            <w:pPr>
+              <w:keepLines/>
+              <w:spacing w:line="240" w:lineRule="auto"/>
+              <w:jc w:val="center"/>
+            </w:pPr>
+            <w:r>
+              <w:rPr>
+                <w:sz w:val="18"/>
+              </w:rPr>
+              <w:t xml:space="preserve">Não</w:t>
+            </w:r>
+          </w:p>
+        </w:tc>
+        <w:tc>
+          <w:tcPr>
+            <w:tcW w:w="4670" w:type="dxa"/>
+            <w:vAlign w:val="center"/>
+          </w:tcPr>
+          <w:p>
+            <w:pPr>
+              <w:keepLines/>
+              <w:spacing w:line="240" w:lineRule="auto"/>
+              <w:jc w:val="center"/>
+            </w:pPr>
+            <w:r>
+              <w:rPr>
+                <w:sz w:val="18"/>
+              </w:rPr>
+              <w:t xml:space="preserve">Data e hora em que a conta Mercado Pago foi conectada. Vazio enquanto não houver conta conectada</w:t>
             </w:r>
           </w:p>
         </w:tc>
@@ -14590,7 +14997,7 @@
               <w:rPr>
                 <w:sz w:val="18"/>
               </w:rPr>
-              <w:t xml:space="preserve">Código exibido no comprovante do consumidor para identificação visual do pedido, no formato GH7-382: duas letras, um dígito, hífen e três dígitos, sem caracteres que se confundem (0 e O, 1 e I). Gerado aleatoriamente; único dentro do evento, e em caso de colisão um novo código é gerado</w:t>
+              <w:t xml:space="preserve">Código exibido no comprovante para identificação visual do pedido, no formato AA0-000 (por exemplo, GH7-382), sem caracteres que se confundem. Gerado aleatoriamente e único dentro do evento</w:t>
             </w:r>
           </w:p>
         </w:tc>
@@ -14697,7 +15104,7 @@
               <w:rPr>
                 <w:sz w:val="18"/>
               </w:rPr>
-              <w:t xml:space="preserve">refunded_amount</w:t>
+              <w:t xml:space="preserve">status</w:t>
             </w:r>
           </w:p>
         </w:tc>
@@ -14716,7 +15123,7 @@
               <w:rPr>
                 <w:sz w:val="18"/>
               </w:rPr>
-              <w:t xml:space="preserve">DECIMAL</w:t>
+              <w:t xml:space="preserve">TEXT</w:t>
             </w:r>
           </w:p>
         </w:tc>
@@ -14754,7 +15161,7 @@
               <w:rPr>
                 <w:sz w:val="18"/>
               </w:rPr>
-              <w:t xml:space="preserve">Soma dos valores de itens do pedido estornados ao consumidor. Inicia em zero. Não inclui os estornos automáticos do sistema (late_payment e duplicate_payment)</w:t>
+              <w:t xml:space="preserve">Estado atual do pedido: awaiting_payment, paid, in_service, collected ou expired</w:t>
             </w:r>
           </w:p>
         </w:tc>
@@ -14779,7 +15186,7 @@
               <w:rPr>
                 <w:sz w:val="18"/>
               </w:rPr>
-              <w:t xml:space="preserve">status</w:t>
+              <w:t xml:space="preserve">paid_at</w:t>
             </w:r>
           </w:p>
         </w:tc>
@@ -14798,7 +15205,7 @@
               <w:rPr>
                 <w:sz w:val="18"/>
               </w:rPr>
-              <w:t xml:space="preserve">TEXT</w:t>
+              <w:t xml:space="preserve">TIMESTAMPTZ</w:t>
             </w:r>
           </w:p>
         </w:tc>
@@ -14817,7 +15224,7 @@
               <w:rPr>
                 <w:sz w:val="18"/>
               </w:rPr>
-              <w:t xml:space="preserve">Sim</w:t>
+              <w:t xml:space="preserve">Não</w:t>
             </w:r>
           </w:p>
         </w:tc>
@@ -14836,89 +15243,7 @@
               <w:rPr>
                 <w:sz w:val="18"/>
               </w:rPr>
-              <w:t xml:space="preserve">Estado atual do pedido: awaiting_payment, paid, in_service, collected, refunded ou expired</w:t>
-            </w:r>
-          </w:p>
-        </w:tc>
-      </w:tr>
-      <w:tr>
-        <w:trPr>
-          <w:cantSplit/>
-          <w:jc w:val="center"/>
-        </w:trPr>
-        <w:tc>
-          <w:tcPr>
-            <w:tcW w:w="1900" w:type="dxa"/>
-            <w:vAlign w:val="center"/>
-          </w:tcPr>
-          <w:p>
-            <w:pPr>
-              <w:keepLines/>
-              <w:spacing w:line="240" w:lineRule="auto"/>
-              <w:jc w:val="center"/>
-            </w:pPr>
-            <w:r>
-              <w:rPr>
-                <w:sz w:val="18"/>
-              </w:rPr>
-              <w:t xml:space="preserve">paid_at</w:t>
-            </w:r>
-          </w:p>
-        </w:tc>
-        <w:tc>
-          <w:tcPr>
-            <w:tcW w:w="1400" w:type="dxa"/>
-            <w:vAlign w:val="center"/>
-          </w:tcPr>
-          <w:p>
-            <w:pPr>
-              <w:keepLines/>
-              <w:spacing w:line="240" w:lineRule="auto"/>
-              <w:jc w:val="center"/>
-            </w:pPr>
-            <w:r>
-              <w:rPr>
-                <w:sz w:val="18"/>
-              </w:rPr>
-              <w:t xml:space="preserve">TIMESTAMPTZ</w:t>
-            </w:r>
-          </w:p>
-        </w:tc>
-        <w:tc>
-          <w:tcPr>
-            <w:tcW w:w="1100" w:type="dxa"/>
-            <w:vAlign w:val="center"/>
-          </w:tcPr>
-          <w:p>
-            <w:pPr>
-              <w:keepLines/>
-              <w:spacing w:line="240" w:lineRule="auto"/>
-              <w:jc w:val="center"/>
-            </w:pPr>
-            <w:r>
-              <w:rPr>
-                <w:sz w:val="18"/>
-              </w:rPr>
-              <w:t xml:space="preserve">Não</w:t>
-            </w:r>
-          </w:p>
-        </w:tc>
-        <w:tc>
-          <w:tcPr>
-            <w:tcW w:w="4670" w:type="dxa"/>
-            <w:vAlign w:val="center"/>
-          </w:tcPr>
-          <w:p>
-            <w:pPr>
-              <w:keepLines/>
-              <w:spacing w:line="240" w:lineRule="auto"/>
-              <w:jc w:val="center"/>
-            </w:pPr>
-            <w:r>
-              <w:rPr>
-                <w:sz w:val="18"/>
-              </w:rPr>
-              <w:t xml:space="preserve">Data e hora em que o pagamento foi confirmado pelo Pagar.me</w:t>
+              <w:t xml:space="preserve">Data e hora em que o pagamento foi confirmado pelo Mercado Pago</w:t>
             </w:r>
           </w:p>
         </w:tc>
@@ -15828,7 +16153,7 @@
               <w:rPr>
                 <w:sz w:val="18"/>
               </w:rPr>
-              <w:t xml:space="preserve">refunded_quantity</w:t>
+              <w:t xml:space="preserve">is_undelivered</w:t>
             </w:r>
           </w:p>
         </w:tc>
@@ -15847,7 +16172,7 @@
               <w:rPr>
                 <w:sz w:val="18"/>
               </w:rPr>
-              <w:t xml:space="preserve">INTEGER</w:t>
+              <w:t xml:space="preserve">BOOLEAN</w:t>
             </w:r>
           </w:p>
         </w:tc>
@@ -15885,7 +16210,7 @@
               <w:rPr>
                 <w:sz w:val="18"/>
               </w:rPr>
-              <w:t xml:space="preserve">Quantidade deste item que foi estornada. Inicia em zero</w:t>
+              <w:t xml:space="preserve">Indica que o item não foi entregue porque acabou. Marcado pelo operador na confirmação da entrega. Inicia como false</w:t>
             </w:r>
           </w:p>
         </w:tc>
@@ -16077,7 +16402,7 @@
         <w:jc w:val="both"/>
       </w:pPr>
       <w:r>
-        <w:t xml:space="preserve">Armazena cada tentativa de pagamento de um pedido. Um pedido pode ter várias tentativas, por exemplo um cartão recusado seguido de um Pix aprovado, e todas ficam registradas.</w:t>
+        <w:t xml:space="preserve">Armazena cada tentativa de pagamento de um pedido. Um pedido pode ter várias tentativas, por exemplo um cartão recusado seguido de um Pix aprovado, mas só uma pode estar pendente por vez.</w:t>
       </w:r>
     </w:p>
     <w:p/>
@@ -16524,7 +16849,7 @@
               <w:rPr>
                 <w:sz w:val="18"/>
               </w:rPr>
-              <w:t xml:space="preserve">Estado da tentativa: pending, paid, failed, expired ou cancelled (Pix cancelado quando o consumidor troca para o cartão). Cada pedido tem no máximo uma tentativa pending por vez</w:t>
+              <w:t xml:space="preserve">Estado da tentativa: pending, paid, failed, cancelled ou expired</w:t>
             </w:r>
           </w:p>
         </w:tc>
@@ -16631,7 +16956,7 @@
               <w:rPr>
                 <w:sz w:val="18"/>
               </w:rPr>
-              <w:t xml:space="preserve">pagarme_order_id</w:t>
+              <w:t xml:space="preserve">mp_payment_id</w:t>
             </w:r>
           </w:p>
         </w:tc>
@@ -16688,7 +17013,7 @@
               <w:rPr>
                 <w:sz w:val="18"/>
               </w:rPr>
-              <w:t xml:space="preserve">Identificador do pedido no Pagar.me</w:t>
+              <w:t xml:space="preserve">Identificador do pagamento no Mercado Pago, usado nas notificações e nas consultas. Único</w:t>
             </w:r>
           </w:p>
         </w:tc>
@@ -16713,7 +17038,7 @@
               <w:rPr>
                 <w:sz w:val="18"/>
               </w:rPr>
-              <w:t xml:space="preserve">pagarme_charge_id</w:t>
+              <w:t xml:space="preserve">application_fee</w:t>
             </w:r>
           </w:p>
         </w:tc>
@@ -16732,7 +17057,7 @@
               <w:rPr>
                 <w:sz w:val="18"/>
               </w:rPr>
-              <w:t xml:space="preserve">TEXT</w:t>
+              <w:t xml:space="preserve">DECIMAL</w:t>
             </w:r>
           </w:p>
         </w:tc>
@@ -16751,7 +17076,7 @@
               <w:rPr>
                 <w:sz w:val="18"/>
               </w:rPr>
-              <w:t xml:space="preserve">Não</w:t>
+              <w:t xml:space="preserve">Sim</w:t>
             </w:r>
           </w:p>
         </w:tc>
@@ -16770,7 +17095,7 @@
               <w:rPr>
                 <w:sz w:val="18"/>
               </w:rPr>
-              <w:t xml:space="preserve">Identificador da cobrança no Pagar.me, usado nos webhooks e nos estornos. Único</w:t>
+              <w:t xml:space="preserve">Comissão da plataforma enviada ao Mercado Pago: 5% do valor total do pedido, calculada pelo backend</w:t>
             </w:r>
           </w:p>
         </w:tc>
@@ -16852,7 +17177,7 @@
               <w:rPr>
                 <w:sz w:val="18"/>
               </w:rPr>
-              <w:t xml:space="preserve">Prazo de pagamento do Pix, igual ao horário limite do pedido (15 minutos após a criação do pedido) e enviado ao Pagar.me como expiração da cobrança. Não se aplica ao cartão</w:t>
+              <w:t xml:space="preserve">Prazo de pagamento do Pix (15 minutos), também enviado ao Mercado Pago. Não se aplica ao cartão</w:t>
             </w:r>
           </w:p>
         </w:tc>
@@ -17126,7 +17451,7 @@
         <w:jc w:val="both"/>
       </w:pPr>
       <w:r>
-        <w:t xml:space="preserve">Registra cada aviso recebido do Pagar.me. Garante a idempotência: um aviso repetido é reconhecido pelo identificador do evento e não é processado novamente.</w:t>
+        <w:t xml:space="preserve">Registra cada notificação recebida do Mercado Pago. Garante a idempotência: uma notificação repetida é reconhecida pelo seu identificador e não é processada novamente.</w:t>
       </w:r>
     </w:p>
     <w:p/>
@@ -17352,7 +17677,7 @@
               <w:rPr>
                 <w:sz w:val="18"/>
               </w:rPr>
-              <w:t xml:space="preserve">pagarme_event_id</w:t>
+              <w:t xml:space="preserve">mp_notification_id</w:t>
             </w:r>
           </w:p>
         </w:tc>
@@ -17409,7 +17734,7 @@
               <w:rPr>
                 <w:sz w:val="18"/>
               </w:rPr>
-              <w:t xml:space="preserve">Identificador do aviso enviado pelo Pagar.me. Único</w:t>
+              <w:t xml:space="preserve">Identificador da notificação enviada pelo Mercado Pago. Único</w:t>
             </w:r>
           </w:p>
         </w:tc>
@@ -17491,7 +17816,7 @@
               <w:rPr>
                 <w:sz w:val="18"/>
               </w:rPr>
-              <w:t xml:space="preserve">Tipo do aviso, por exemplo charge.paid ou charge.refunded</w:t>
+              <w:t xml:space="preserve">Tipo da notificação, por exemplo payment.created ou payment.updated</w:t>
             </w:r>
           </w:p>
         </w:tc>
@@ -17573,7 +17898,7 @@
               <w:rPr>
                 <w:sz w:val="18"/>
               </w:rPr>
-              <w:t xml:space="preserve">Conteúdo completo do aviso, para auditoria</w:t>
+              <w:t xml:space="preserve">Conteúdo completo da notificação, para auditoria</w:t>
             </w:r>
           </w:p>
         </w:tc>
@@ -17747,15 +18072,28 @@
     <w:p/>
     <w:p>
       <w:pPr>
+        <w:pStyle w:val="Ttulo1"/>
+        <w:keepNext/>
+        <w:spacing w:line="360" w:lineRule="auto"/>
+      </w:pPr>
+      <w:bookmarkStart w:id="32" w:name="_Toc237459132"/>
+      <w:r>
+        <w:t>9 MODELO DE NEGÓCIO</w:t>
+      </w:r>
+      <w:bookmarkEnd w:id="32"/>
+    </w:p>
+    <w:p/>
+    <w:p>
+      <w:pPr>
         <w:pStyle w:val="Ttulo2"/>
         <w:keepNext/>
         <w:spacing w:line="360" w:lineRule="auto"/>
       </w:pPr>
-      <w:bookmarkStart w:id="917" w:name="_Toc2374592917"/>
-      <w:r>
-        <w:t xml:space="preserve">8.11 Tabela: refunds</w:t>
-      </w:r>
-      <w:bookmarkEnd w:id="917"/>
+      <w:bookmarkStart w:id="33" w:name="_Toc237459133"/>
+      <w:r>
+        <w:t>9.1 Modelo de Receita</w:t>
+      </w:r>
+      <w:bookmarkEnd w:id="33"/>
     </w:p>
     <w:p/>
     <w:p>
@@ -17765,1626 +18103,7 @@
         <w:jc w:val="both"/>
       </w:pPr>
       <w:r>
-        <w:t xml:space="preserve">Registra cada estorno realizado, parcial ou total, com o operador responsável, permitindo a auditoria pelo estabelecimento. Também registra os estornos automáticos feitos pelo sistema, sem operador: pagamento confirmado depois de o pedido expirar e pagamento em duplicidade.</w:t>
-      </w:r>
-    </w:p>
-    <w:p/>
-    <w:tbl>
-      <w:tblPr>
-        <w:tblW w:w="9070" w:type="dxa"/>
-        <w:jc w:val="center"/>
-        <w:tblBorders>
-          <w:top w:val="single" w:sz="4" w:space="0" w:color="auto"/>
-          <w:left w:val="single" w:sz="4" w:space="0" w:color="auto"/>
-          <w:bottom w:val="single" w:sz="4" w:space="0" w:color="auto"/>
-          <w:right w:val="single" w:sz="4" w:space="0" w:color="auto"/>
-          <w:insideH w:val="single" w:sz="4" w:space="0" w:color="auto"/>
-          <w:insideV w:val="single" w:sz="4" w:space="0" w:color="auto"/>
-        </w:tblBorders>
-        <w:tblLayout w:type="fixed"/>
-        <w:tblCellMar>
-          <w:left w:w="40" w:type="dxa"/>
-          <w:right w:w="40" w:type="dxa"/>
-        </w:tblCellMar>
-        <w:tblLook w:val="0000" w:firstRow="0" w:lastRow="0" w:firstColumn="0" w:lastColumn="0" w:noHBand="0" w:noVBand="0"/>
-      </w:tblPr>
-      <w:tblGrid>
-        <w:gridCol w:w="1900"/>
-        <w:gridCol w:w="1400"/>
-        <w:gridCol w:w="1100"/>
-        <w:gridCol w:w="4670"/>
-      </w:tblGrid>
-      <w:tr>
-        <w:trPr>
-          <w:cantSplit/>
-          <w:tblHeader/>
-          <w:jc w:val="center"/>
-        </w:trPr>
-        <w:tc>
-          <w:tcPr>
-            <w:tcW w:w="1900" w:type="dxa"/>
-            <w:shd w:val="clear" w:color="CCCCCC" w:fill="CCCCCC"/>
-            <w:vAlign w:val="center"/>
-          </w:tcPr>
-          <w:p>
-            <w:pPr>
-              <w:keepLines/>
-              <w:spacing w:line="240" w:lineRule="auto"/>
-              <w:jc w:val="center"/>
-            </w:pPr>
-            <w:r>
-              <w:rPr>
-                <w:b/>
-                <w:bCs/>
-                <w:sz w:val="18"/>
-              </w:rPr>
-              <w:t xml:space="preserve">Campo</w:t>
-            </w:r>
-          </w:p>
-        </w:tc>
-        <w:tc>
-          <w:tcPr>
-            <w:tcW w:w="1400" w:type="dxa"/>
-            <w:shd w:val="clear" w:color="CCCCCC" w:fill="CCCCCC"/>
-            <w:vAlign w:val="center"/>
-          </w:tcPr>
-          <w:p>
-            <w:pPr>
-              <w:keepLines/>
-              <w:spacing w:line="240" w:lineRule="auto"/>
-              <w:jc w:val="center"/>
-            </w:pPr>
-            <w:r>
-              <w:rPr>
-                <w:b/>
-                <w:bCs/>
-                <w:sz w:val="18"/>
-              </w:rPr>
-              <w:t xml:space="preserve">Tipo</w:t>
-            </w:r>
-          </w:p>
-        </w:tc>
-        <w:tc>
-          <w:tcPr>
-            <w:tcW w:w="1100" w:type="dxa"/>
-            <w:shd w:val="clear" w:color="CCCCCC" w:fill="CCCCCC"/>
-            <w:vAlign w:val="center"/>
-          </w:tcPr>
-          <w:p>
-            <w:pPr>
-              <w:keepLines/>
-              <w:spacing w:line="240" w:lineRule="auto"/>
-              <w:jc w:val="center"/>
-            </w:pPr>
-            <w:r>
-              <w:rPr>
-                <w:b/>
-                <w:bCs/>
-                <w:sz w:val="18"/>
-              </w:rPr>
-              <w:t xml:space="preserve">Obrigatório</w:t>
-            </w:r>
-          </w:p>
-        </w:tc>
-        <w:tc>
-          <w:tcPr>
-            <w:tcW w:w="4670" w:type="dxa"/>
-            <w:shd w:val="clear" w:color="CCCCCC" w:fill="CCCCCC"/>
-            <w:vAlign w:val="center"/>
-          </w:tcPr>
-          <w:p>
-            <w:pPr>
-              <w:keepLines/>
-              <w:spacing w:line="240" w:lineRule="auto"/>
-              <w:jc w:val="center"/>
-            </w:pPr>
-            <w:r>
-              <w:rPr>
-                <w:b/>
-                <w:bCs/>
-                <w:sz w:val="18"/>
-              </w:rPr>
-              <w:t xml:space="preserve">Descrição</w:t>
-            </w:r>
-          </w:p>
-        </w:tc>
-      </w:tr>
-      <w:tr>
-        <w:trPr>
-          <w:cantSplit/>
-          <w:jc w:val="center"/>
-        </w:trPr>
-        <w:tc>
-          <w:tcPr>
-            <w:tcW w:w="1900" w:type="dxa"/>
-            <w:vAlign w:val="center"/>
-          </w:tcPr>
-          <w:p>
-            <w:pPr>
-              <w:keepLines/>
-              <w:spacing w:line="240" w:lineRule="auto"/>
-              <w:jc w:val="center"/>
-            </w:pPr>
-            <w:r>
-              <w:rPr>
-                <w:sz w:val="18"/>
-              </w:rPr>
-              <w:t xml:space="preserve">id</w:t>
-            </w:r>
-          </w:p>
-        </w:tc>
-        <w:tc>
-          <w:tcPr>
-            <w:tcW w:w="1400" w:type="dxa"/>
-            <w:vAlign w:val="center"/>
-          </w:tcPr>
-          <w:p>
-            <w:pPr>
-              <w:keepLines/>
-              <w:spacing w:line="240" w:lineRule="auto"/>
-              <w:jc w:val="center"/>
-            </w:pPr>
-            <w:r>
-              <w:rPr>
-                <w:sz w:val="18"/>
-              </w:rPr>
-              <w:t xml:space="preserve">UUID</w:t>
-            </w:r>
-          </w:p>
-        </w:tc>
-        <w:tc>
-          <w:tcPr>
-            <w:tcW w:w="1100" w:type="dxa"/>
-            <w:vAlign w:val="center"/>
-          </w:tcPr>
-          <w:p>
-            <w:pPr>
-              <w:keepLines/>
-              <w:spacing w:line="240" w:lineRule="auto"/>
-              <w:jc w:val="center"/>
-            </w:pPr>
-            <w:r>
-              <w:rPr>
-                <w:sz w:val="18"/>
-              </w:rPr>
-              <w:t xml:space="preserve">Sim</w:t>
-            </w:r>
-          </w:p>
-        </w:tc>
-        <w:tc>
-          <w:tcPr>
-            <w:tcW w:w="4670" w:type="dxa"/>
-            <w:vAlign w:val="center"/>
-          </w:tcPr>
-          <w:p>
-            <w:pPr>
-              <w:keepLines/>
-              <w:spacing w:line="240" w:lineRule="auto"/>
-              <w:jc w:val="center"/>
-            </w:pPr>
-            <w:r>
-              <w:rPr>
-                <w:sz w:val="18"/>
-              </w:rPr>
-              <w:t xml:space="preserve">Identificador único do estorno</w:t>
-            </w:r>
-          </w:p>
-        </w:tc>
-      </w:tr>
-      <w:tr>
-        <w:trPr>
-          <w:cantSplit/>
-          <w:jc w:val="center"/>
-        </w:trPr>
-        <w:tc>
-          <w:tcPr>
-            <w:tcW w:w="1900" w:type="dxa"/>
-            <w:vAlign w:val="center"/>
-          </w:tcPr>
-          <w:p>
-            <w:pPr>
-              <w:keepLines/>
-              <w:spacing w:line="240" w:lineRule="auto"/>
-              <w:jc w:val="center"/>
-            </w:pPr>
-            <w:r>
-              <w:rPr>
-                <w:sz w:val="18"/>
-              </w:rPr>
-              <w:t xml:space="preserve">order_id</w:t>
-            </w:r>
-          </w:p>
-        </w:tc>
-        <w:tc>
-          <w:tcPr>
-            <w:tcW w:w="1400" w:type="dxa"/>
-            <w:vAlign w:val="center"/>
-          </w:tcPr>
-          <w:p>
-            <w:pPr>
-              <w:keepLines/>
-              <w:spacing w:line="240" w:lineRule="auto"/>
-              <w:jc w:val="center"/>
-            </w:pPr>
-            <w:r>
-              <w:rPr>
-                <w:sz w:val="18"/>
-              </w:rPr>
-              <w:t xml:space="preserve">UUID</w:t>
-            </w:r>
-          </w:p>
-        </w:tc>
-        <w:tc>
-          <w:tcPr>
-            <w:tcW w:w="1100" w:type="dxa"/>
-            <w:vAlign w:val="center"/>
-          </w:tcPr>
-          <w:p>
-            <w:pPr>
-              <w:keepLines/>
-              <w:spacing w:line="240" w:lineRule="auto"/>
-              <w:jc w:val="center"/>
-            </w:pPr>
-            <w:r>
-              <w:rPr>
-                <w:sz w:val="18"/>
-              </w:rPr>
-              <w:t xml:space="preserve">Sim</w:t>
-            </w:r>
-          </w:p>
-        </w:tc>
-        <w:tc>
-          <w:tcPr>
-            <w:tcW w:w="4670" w:type="dxa"/>
-            <w:vAlign w:val="center"/>
-          </w:tcPr>
-          <w:p>
-            <w:pPr>
-              <w:keepLines/>
-              <w:spacing w:line="240" w:lineRule="auto"/>
-              <w:jc w:val="center"/>
-            </w:pPr>
-            <w:r>
-              <w:rPr>
-                <w:sz w:val="18"/>
-              </w:rPr>
-              <w:t xml:space="preserve">Referência ao pedido estornado. Chave estrangeira para a tabela orders</w:t>
-            </w:r>
-          </w:p>
-        </w:tc>
-      </w:tr>
-      <w:tr>
-        <w:trPr>
-          <w:cantSplit/>
-          <w:jc w:val="center"/>
-        </w:trPr>
-        <w:tc>
-          <w:tcPr>
-            <w:tcW w:w="1900" w:type="dxa"/>
-            <w:vAlign w:val="center"/>
-          </w:tcPr>
-          <w:p>
-            <w:pPr>
-              <w:keepLines/>
-              <w:spacing w:line="240" w:lineRule="auto"/>
-              <w:jc w:val="center"/>
-            </w:pPr>
-            <w:r>
-              <w:rPr>
-                <w:sz w:val="18"/>
-              </w:rPr>
-              <w:t xml:space="preserve">payment_id</w:t>
-            </w:r>
-          </w:p>
-        </w:tc>
-        <w:tc>
-          <w:tcPr>
-            <w:tcW w:w="1400" w:type="dxa"/>
-            <w:vAlign w:val="center"/>
-          </w:tcPr>
-          <w:p>
-            <w:pPr>
-              <w:keepLines/>
-              <w:spacing w:line="240" w:lineRule="auto"/>
-              <w:jc w:val="center"/>
-            </w:pPr>
-            <w:r>
-              <w:rPr>
-                <w:sz w:val="18"/>
-              </w:rPr>
-              <w:t xml:space="preserve">UUID</w:t>
-            </w:r>
-          </w:p>
-        </w:tc>
-        <w:tc>
-          <w:tcPr>
-            <w:tcW w:w="1100" w:type="dxa"/>
-            <w:vAlign w:val="center"/>
-          </w:tcPr>
-          <w:p>
-            <w:pPr>
-              <w:keepLines/>
-              <w:spacing w:line="240" w:lineRule="auto"/>
-              <w:jc w:val="center"/>
-            </w:pPr>
-            <w:r>
-              <w:rPr>
-                <w:sz w:val="18"/>
-              </w:rPr>
-              <w:t xml:space="preserve">Sim</w:t>
-            </w:r>
-          </w:p>
-        </w:tc>
-        <w:tc>
-          <w:tcPr>
-            <w:tcW w:w="4670" w:type="dxa"/>
-            <w:vAlign w:val="center"/>
-          </w:tcPr>
-          <w:p>
-            <w:pPr>
-              <w:keepLines/>
-              <w:spacing w:line="240" w:lineRule="auto"/>
-              <w:jc w:val="center"/>
-            </w:pPr>
-            <w:r>
-              <w:rPr>
-                <w:sz w:val="18"/>
-              </w:rPr>
-              <w:t xml:space="preserve">Referência à tentativa de pagamento aprovada que será estornada. Chave estrangeira para a tabela payments</w:t>
-            </w:r>
-          </w:p>
-        </w:tc>
-      </w:tr>
-      <w:tr>
-        <w:trPr>
-          <w:cantSplit/>
-          <w:jc w:val="center"/>
-        </w:trPr>
-        <w:tc>
-          <w:tcPr>
-            <w:tcW w:w="1900" w:type="dxa"/>
-            <w:vAlign w:val="center"/>
-          </w:tcPr>
-          <w:p>
-            <w:pPr>
-              <w:keepLines/>
-              <w:spacing w:line="240" w:lineRule="auto"/>
-              <w:jc w:val="center"/>
-            </w:pPr>
-            <w:r>
-              <w:rPr>
-                <w:sz w:val="18"/>
-              </w:rPr>
-              <w:t xml:space="preserve">operator_id</w:t>
-            </w:r>
-          </w:p>
-        </w:tc>
-        <w:tc>
-          <w:tcPr>
-            <w:tcW w:w="1400" w:type="dxa"/>
-            <w:vAlign w:val="center"/>
-          </w:tcPr>
-          <w:p>
-            <w:pPr>
-              <w:keepLines/>
-              <w:spacing w:line="240" w:lineRule="auto"/>
-              <w:jc w:val="center"/>
-            </w:pPr>
-            <w:r>
-              <w:rPr>
-                <w:sz w:val="18"/>
-              </w:rPr>
-              <w:t xml:space="preserve">UUID</w:t>
-            </w:r>
-          </w:p>
-        </w:tc>
-        <w:tc>
-          <w:tcPr>
-            <w:tcW w:w="1100" w:type="dxa"/>
-            <w:vAlign w:val="center"/>
-          </w:tcPr>
-          <w:p>
-            <w:pPr>
-              <w:keepLines/>
-              <w:spacing w:line="240" w:lineRule="auto"/>
-              <w:jc w:val="center"/>
-            </w:pPr>
-            <w:r>
-              <w:rPr>
-                <w:sz w:val="18"/>
-              </w:rPr>
-              <w:t xml:space="preserve">Não</w:t>
-            </w:r>
-          </w:p>
-        </w:tc>
-        <w:tc>
-          <w:tcPr>
-            <w:tcW w:w="4670" w:type="dxa"/>
-            <w:vAlign w:val="center"/>
-          </w:tcPr>
-          <w:p>
-            <w:pPr>
-              <w:keepLines/>
-              <w:spacing w:line="240" w:lineRule="auto"/>
-              <w:jc w:val="center"/>
-            </w:pPr>
-            <w:r>
-              <w:rPr>
-                <w:sz w:val="18"/>
-              </w:rPr>
-              <w:t xml:space="preserve">Referência ao operador que registrou o estorno. Chave estrangeira para a tabela operators. Vazio nos estornos automáticos do sistema</w:t>
-            </w:r>
-          </w:p>
-        </w:tc>
-      </w:tr>
-      <w:tr>
-        <w:trPr>
-          <w:cantSplit/>
-          <w:jc w:val="center"/>
-        </w:trPr>
-        <w:tc>
-          <w:tcPr>
-            <w:tcW w:w="1900" w:type="dxa"/>
-            <w:vAlign w:val="center"/>
-          </w:tcPr>
-          <w:p>
-            <w:pPr>
-              <w:keepLines/>
-              <w:spacing w:line="240" w:lineRule="auto"/>
-              <w:jc w:val="center"/>
-            </w:pPr>
-            <w:r>
-              <w:rPr>
-                <w:sz w:val="18"/>
-              </w:rPr>
-              <w:t xml:space="preserve">amount</w:t>
-            </w:r>
-          </w:p>
-        </w:tc>
-        <w:tc>
-          <w:tcPr>
-            <w:tcW w:w="1400" w:type="dxa"/>
-            <w:vAlign w:val="center"/>
-          </w:tcPr>
-          <w:p>
-            <w:pPr>
-              <w:keepLines/>
-              <w:spacing w:line="240" w:lineRule="auto"/>
-              <w:jc w:val="center"/>
-            </w:pPr>
-            <w:r>
-              <w:rPr>
-                <w:sz w:val="18"/>
-              </w:rPr>
-              <w:t xml:space="preserve">DECIMAL</w:t>
-            </w:r>
-          </w:p>
-        </w:tc>
-        <w:tc>
-          <w:tcPr>
-            <w:tcW w:w="1100" w:type="dxa"/>
-            <w:vAlign w:val="center"/>
-          </w:tcPr>
-          <w:p>
-            <w:pPr>
-              <w:keepLines/>
-              <w:spacing w:line="240" w:lineRule="auto"/>
-              <w:jc w:val="center"/>
-            </w:pPr>
-            <w:r>
-              <w:rPr>
-                <w:sz w:val="18"/>
-              </w:rPr>
-              <w:t xml:space="preserve">Sim</w:t>
-            </w:r>
-          </w:p>
-        </w:tc>
-        <w:tc>
-          <w:tcPr>
-            <w:tcW w:w="4670" w:type="dxa"/>
-            <w:vAlign w:val="center"/>
-          </w:tcPr>
-          <w:p>
-            <w:pPr>
-              <w:keepLines/>
-              <w:spacing w:line="240" w:lineRule="auto"/>
-              <w:jc w:val="center"/>
-            </w:pPr>
-            <w:r>
-              <w:rPr>
-                <w:sz w:val="18"/>
-              </w:rPr>
-              <w:t xml:space="preserve">Valor devolvido ao consumidor</w:t>
-            </w:r>
-          </w:p>
-        </w:tc>
-      </w:tr>
-      <w:tr>
-        <w:trPr>
-          <w:cantSplit/>
-          <w:jc w:val="center"/>
-        </w:trPr>
-        <w:tc>
-          <w:tcPr>
-            <w:tcW w:w="1900" w:type="dxa"/>
-            <w:vAlign w:val="center"/>
-          </w:tcPr>
-          <w:p>
-            <w:pPr>
-              <w:keepLines/>
-              <w:spacing w:line="240" w:lineRule="auto"/>
-              <w:jc w:val="center"/>
-            </w:pPr>
-            <w:r>
-              <w:rPr>
-                <w:sz w:val="18"/>
-              </w:rPr>
-              <w:t xml:space="preserve">reason</w:t>
-            </w:r>
-          </w:p>
-        </w:tc>
-        <w:tc>
-          <w:tcPr>
-            <w:tcW w:w="1400" w:type="dxa"/>
-            <w:vAlign w:val="center"/>
-          </w:tcPr>
-          <w:p>
-            <w:pPr>
-              <w:keepLines/>
-              <w:spacing w:line="240" w:lineRule="auto"/>
-              <w:jc w:val="center"/>
-            </w:pPr>
-            <w:r>
-              <w:rPr>
-                <w:sz w:val="18"/>
-              </w:rPr>
-              <w:t xml:space="preserve">TEXT</w:t>
-            </w:r>
-          </w:p>
-        </w:tc>
-        <w:tc>
-          <w:tcPr>
-            <w:tcW w:w="1100" w:type="dxa"/>
-            <w:vAlign w:val="center"/>
-          </w:tcPr>
-          <w:p>
-            <w:pPr>
-              <w:keepLines/>
-              <w:spacing w:line="240" w:lineRule="auto"/>
-              <w:jc w:val="center"/>
-            </w:pPr>
-            <w:r>
-              <w:rPr>
-                <w:sz w:val="18"/>
-              </w:rPr>
-              <w:t xml:space="preserve">Sim</w:t>
-            </w:r>
-          </w:p>
-        </w:tc>
-        <w:tc>
-          <w:tcPr>
-            <w:tcW w:w="4670" w:type="dxa"/>
-            <w:vAlign w:val="center"/>
-          </w:tcPr>
-          <w:p>
-            <w:pPr>
-              <w:keepLines/>
-              <w:spacing w:line="240" w:lineRule="auto"/>
-              <w:jc w:val="center"/>
-            </w:pPr>
-            <w:r>
-              <w:rPr>
-                <w:sz w:val="18"/>
-              </w:rPr>
-              <w:t xml:space="preserve">Motivo do estorno: item_sold_out (item esgotado) ou order_cancelled (pedido inteiro estornado), registrados pelo operador; late_payment (pagamento confirmado após a expiração do pedido) ou duplicate_payment (segunda tentativa aprovada para o mesmo pedido), registrados automaticamente pelo sistema. operator_id é obrigatório nos dois primeiros e vazio nos dois últimos (restrição CHECK)</w:t>
-            </w:r>
-          </w:p>
-        </w:tc>
-      </w:tr>
-      <w:tr>
-        <w:trPr>
-          <w:cantSplit/>
-          <w:jc w:val="center"/>
-        </w:trPr>
-        <w:tc>
-          <w:tcPr>
-            <w:tcW w:w="1900" w:type="dxa"/>
-            <w:vAlign w:val="center"/>
-          </w:tcPr>
-          <w:p>
-            <w:pPr>
-              <w:keepLines/>
-              <w:spacing w:line="240" w:lineRule="auto"/>
-              <w:jc w:val="center"/>
-            </w:pPr>
-            <w:r>
-              <w:rPr>
-                <w:sz w:val="18"/>
-              </w:rPr>
-              <w:t xml:space="preserve">status</w:t>
-            </w:r>
-          </w:p>
-        </w:tc>
-        <w:tc>
-          <w:tcPr>
-            <w:tcW w:w="1400" w:type="dxa"/>
-            <w:vAlign w:val="center"/>
-          </w:tcPr>
-          <w:p>
-            <w:pPr>
-              <w:keepLines/>
-              <w:spacing w:line="240" w:lineRule="auto"/>
-              <w:jc w:val="center"/>
-            </w:pPr>
-            <w:r>
-              <w:rPr>
-                <w:sz w:val="18"/>
-              </w:rPr>
-              <w:t xml:space="preserve">TEXT</w:t>
-            </w:r>
-          </w:p>
-        </w:tc>
-        <w:tc>
-          <w:tcPr>
-            <w:tcW w:w="1100" w:type="dxa"/>
-            <w:vAlign w:val="center"/>
-          </w:tcPr>
-          <w:p>
-            <w:pPr>
-              <w:keepLines/>
-              <w:spacing w:line="240" w:lineRule="auto"/>
-              <w:jc w:val="center"/>
-            </w:pPr>
-            <w:r>
-              <w:rPr>
-                <w:sz w:val="18"/>
-              </w:rPr>
-              <w:t xml:space="preserve">Sim</w:t>
-            </w:r>
-          </w:p>
-        </w:tc>
-        <w:tc>
-          <w:tcPr>
-            <w:tcW w:w="4670" w:type="dxa"/>
-            <w:vAlign w:val="center"/>
-          </w:tcPr>
-          <w:p>
-            <w:pPr>
-              <w:keepLines/>
-              <w:spacing w:line="240" w:lineRule="auto"/>
-              <w:jc w:val="center"/>
-            </w:pPr>
-            <w:r>
-              <w:rPr>
-                <w:sz w:val="18"/>
-              </w:rPr>
-              <w:t xml:space="preserve">Situação do estorno no Pagar.me: pending, completed ou failed</w:t>
-            </w:r>
-          </w:p>
-        </w:tc>
-      </w:tr>
-      <w:tr>
-        <w:trPr>
-          <w:cantSplit/>
-          <w:jc w:val="center"/>
-        </w:trPr>
-        <w:tc>
-          <w:tcPr>
-            <w:tcW w:w="1900" w:type="dxa"/>
-            <w:vAlign w:val="center"/>
-          </w:tcPr>
-          <w:p>
-            <w:pPr>
-              <w:keepLines/>
-              <w:spacing w:line="240" w:lineRule="auto"/>
-              <w:jc w:val="center"/>
-            </w:pPr>
-            <w:r>
-              <w:rPr>
-                <w:sz w:val="18"/>
-              </w:rPr>
-              <w:t xml:space="preserve">created_at</w:t>
-            </w:r>
-          </w:p>
-        </w:tc>
-        <w:tc>
-          <w:tcPr>
-            <w:tcW w:w="1400" w:type="dxa"/>
-            <w:vAlign w:val="center"/>
-          </w:tcPr>
-          <w:p>
-            <w:pPr>
-              <w:keepLines/>
-              <w:spacing w:line="240" w:lineRule="auto"/>
-              <w:jc w:val="center"/>
-            </w:pPr>
-            <w:r>
-              <w:rPr>
-                <w:sz w:val="18"/>
-              </w:rPr>
-              <w:t xml:space="preserve">TIMESTAMPTZ</w:t>
-            </w:r>
-          </w:p>
-        </w:tc>
-        <w:tc>
-          <w:tcPr>
-            <w:tcW w:w="1100" w:type="dxa"/>
-            <w:vAlign w:val="center"/>
-          </w:tcPr>
-          <w:p>
-            <w:pPr>
-              <w:keepLines/>
-              <w:spacing w:line="240" w:lineRule="auto"/>
-              <w:jc w:val="center"/>
-            </w:pPr>
-            <w:r>
-              <w:rPr>
-                <w:sz w:val="18"/>
-              </w:rPr>
-              <w:t xml:space="preserve">Sim</w:t>
-            </w:r>
-          </w:p>
-        </w:tc>
-        <w:tc>
-          <w:tcPr>
-            <w:tcW w:w="4670" w:type="dxa"/>
-            <w:vAlign w:val="center"/>
-          </w:tcPr>
-          <w:p>
-            <w:pPr>
-              <w:keepLines/>
-              <w:spacing w:line="240" w:lineRule="auto"/>
-              <w:jc w:val="center"/>
-            </w:pPr>
-            <w:r>
-              <w:rPr>
-                <w:sz w:val="18"/>
-              </w:rPr>
-              <w:t xml:space="preserve">Data e hora em que o estorno foi registrado</w:t>
-            </w:r>
-          </w:p>
-        </w:tc>
-      </w:tr>
-      <w:tr>
-        <w:trPr>
-          <w:cantSplit/>
-          <w:jc w:val="center"/>
-        </w:trPr>
-        <w:tc>
-          <w:tcPr>
-            <w:tcW w:w="1900" w:type="dxa"/>
-            <w:vAlign w:val="center"/>
-          </w:tcPr>
-          <w:p>
-            <w:pPr>
-              <w:keepLines/>
-              <w:spacing w:line="240" w:lineRule="auto"/>
-              <w:jc w:val="center"/>
-            </w:pPr>
-            <w:r>
-              <w:rPr>
-                <w:sz w:val="18"/>
-              </w:rPr>
-              <w:t xml:space="preserve">updated_at</w:t>
-            </w:r>
-          </w:p>
-        </w:tc>
-        <w:tc>
-          <w:tcPr>
-            <w:tcW w:w="1400" w:type="dxa"/>
-            <w:vAlign w:val="center"/>
-          </w:tcPr>
-          <w:p>
-            <w:pPr>
-              <w:keepLines/>
-              <w:spacing w:line="240" w:lineRule="auto"/>
-              <w:jc w:val="center"/>
-            </w:pPr>
-            <w:r>
-              <w:rPr>
-                <w:sz w:val="18"/>
-              </w:rPr>
-              <w:t xml:space="preserve">TIMESTAMPTZ</w:t>
-            </w:r>
-          </w:p>
-        </w:tc>
-        <w:tc>
-          <w:tcPr>
-            <w:tcW w:w="1100" w:type="dxa"/>
-            <w:vAlign w:val="center"/>
-          </w:tcPr>
-          <w:p>
-            <w:pPr>
-              <w:keepLines/>
-              <w:spacing w:line="240" w:lineRule="auto"/>
-              <w:jc w:val="center"/>
-            </w:pPr>
-            <w:r>
-              <w:rPr>
-                <w:sz w:val="18"/>
-              </w:rPr>
-              <w:t xml:space="preserve">Sim</w:t>
-            </w:r>
-          </w:p>
-        </w:tc>
-        <w:tc>
-          <w:tcPr>
-            <w:tcW w:w="4670" w:type="dxa"/>
-            <w:vAlign w:val="center"/>
-          </w:tcPr>
-          <w:p>
-            <w:pPr>
-              <w:keepLines/>
-              <w:spacing w:line="240" w:lineRule="auto"/>
-              <w:jc w:val="center"/>
-            </w:pPr>
-            <w:r>
-              <w:rPr>
-                <w:sz w:val="18"/>
-              </w:rPr>
-              <w:t xml:space="preserve">Data e hora da última alteração do registro</w:t>
-            </w:r>
-          </w:p>
-        </w:tc>
-      </w:tr>
-    </w:tbl>
-    <w:p/>
-    <w:p/>
-    <w:p>
-      <w:pPr>
-        <w:pStyle w:val="Ttulo2"/>
-        <w:keepNext/>
-        <w:spacing w:line="360" w:lineRule="auto"/>
-      </w:pPr>
-      <w:bookmarkStart w:id="918" w:name="_Toc2374592918"/>
-      <w:r>
-        <w:t xml:space="preserve">8.12 Tabela: refund_items</w:t>
-      </w:r>
-      <w:bookmarkEnd w:id="918"/>
-    </w:p>
-    <w:p/>
-    <w:p>
-      <w:pPr>
-        <w:spacing w:line="360" w:lineRule="auto"/>
-        <w:ind w:firstLine="706"/>
-        <w:jc w:val="both"/>
-      </w:pPr>
-      <w:r>
-        <w:t xml:space="preserve">Registra quais itens e quantidades fizeram parte de cada estorno. Os estornos automáticos do sistema (late_payment e duplicate_payment) devolvem a tentativa de pagamento inteira e não possuem registros nesta tabela.</w:t>
-      </w:r>
-    </w:p>
-    <w:p/>
-    <w:tbl>
-      <w:tblPr>
-        <w:tblW w:w="9070" w:type="dxa"/>
-        <w:jc w:val="center"/>
-        <w:tblBorders>
-          <w:top w:val="single" w:sz="4" w:space="0" w:color="auto"/>
-          <w:left w:val="single" w:sz="4" w:space="0" w:color="auto"/>
-          <w:bottom w:val="single" w:sz="4" w:space="0" w:color="auto"/>
-          <w:right w:val="single" w:sz="4" w:space="0" w:color="auto"/>
-          <w:insideH w:val="single" w:sz="4" w:space="0" w:color="auto"/>
-          <w:insideV w:val="single" w:sz="4" w:space="0" w:color="auto"/>
-        </w:tblBorders>
-        <w:tblLayout w:type="fixed"/>
-        <w:tblCellMar>
-          <w:left w:w="40" w:type="dxa"/>
-          <w:right w:w="40" w:type="dxa"/>
-        </w:tblCellMar>
-        <w:tblLook w:val="0000" w:firstRow="0" w:lastRow="0" w:firstColumn="0" w:lastColumn="0" w:noHBand="0" w:noVBand="0"/>
-      </w:tblPr>
-      <w:tblGrid>
-        <w:gridCol w:w="1900"/>
-        <w:gridCol w:w="1400"/>
-        <w:gridCol w:w="1100"/>
-        <w:gridCol w:w="4670"/>
-      </w:tblGrid>
-      <w:tr>
-        <w:trPr>
-          <w:cantSplit/>
-          <w:tblHeader/>
-          <w:jc w:val="center"/>
-        </w:trPr>
-        <w:tc>
-          <w:tcPr>
-            <w:tcW w:w="1900" w:type="dxa"/>
-            <w:shd w:val="clear" w:color="CCCCCC" w:fill="CCCCCC"/>
-            <w:vAlign w:val="center"/>
-          </w:tcPr>
-          <w:p>
-            <w:pPr>
-              <w:keepLines/>
-              <w:spacing w:line="240" w:lineRule="auto"/>
-              <w:jc w:val="center"/>
-            </w:pPr>
-            <w:r>
-              <w:rPr>
-                <w:b/>
-                <w:bCs/>
-                <w:sz w:val="18"/>
-              </w:rPr>
-              <w:t xml:space="preserve">Campo</w:t>
-            </w:r>
-          </w:p>
-        </w:tc>
-        <w:tc>
-          <w:tcPr>
-            <w:tcW w:w="1400" w:type="dxa"/>
-            <w:shd w:val="clear" w:color="CCCCCC" w:fill="CCCCCC"/>
-            <w:vAlign w:val="center"/>
-          </w:tcPr>
-          <w:p>
-            <w:pPr>
-              <w:keepLines/>
-              <w:spacing w:line="240" w:lineRule="auto"/>
-              <w:jc w:val="center"/>
-            </w:pPr>
-            <w:r>
-              <w:rPr>
-                <w:b/>
-                <w:bCs/>
-                <w:sz w:val="18"/>
-              </w:rPr>
-              <w:t xml:space="preserve">Tipo</w:t>
-            </w:r>
-          </w:p>
-        </w:tc>
-        <w:tc>
-          <w:tcPr>
-            <w:tcW w:w="1100" w:type="dxa"/>
-            <w:shd w:val="clear" w:color="CCCCCC" w:fill="CCCCCC"/>
-            <w:vAlign w:val="center"/>
-          </w:tcPr>
-          <w:p>
-            <w:pPr>
-              <w:keepLines/>
-              <w:spacing w:line="240" w:lineRule="auto"/>
-              <w:jc w:val="center"/>
-            </w:pPr>
-            <w:r>
-              <w:rPr>
-                <w:b/>
-                <w:bCs/>
-                <w:sz w:val="18"/>
-              </w:rPr>
-              <w:t xml:space="preserve">Obrigatório</w:t>
-            </w:r>
-          </w:p>
-        </w:tc>
-        <w:tc>
-          <w:tcPr>
-            <w:tcW w:w="4670" w:type="dxa"/>
-            <w:shd w:val="clear" w:color="CCCCCC" w:fill="CCCCCC"/>
-            <w:vAlign w:val="center"/>
-          </w:tcPr>
-          <w:p>
-            <w:pPr>
-              <w:keepLines/>
-              <w:spacing w:line="240" w:lineRule="auto"/>
-              <w:jc w:val="center"/>
-            </w:pPr>
-            <w:r>
-              <w:rPr>
-                <w:b/>
-                <w:bCs/>
-                <w:sz w:val="18"/>
-              </w:rPr>
-              <w:t xml:space="preserve">Descrição</w:t>
-            </w:r>
-          </w:p>
-        </w:tc>
-      </w:tr>
-      <w:tr>
-        <w:trPr>
-          <w:cantSplit/>
-          <w:jc w:val="center"/>
-        </w:trPr>
-        <w:tc>
-          <w:tcPr>
-            <w:tcW w:w="1900" w:type="dxa"/>
-            <w:vAlign w:val="center"/>
-          </w:tcPr>
-          <w:p>
-            <w:pPr>
-              <w:keepLines/>
-              <w:spacing w:line="240" w:lineRule="auto"/>
-              <w:jc w:val="center"/>
-            </w:pPr>
-            <w:r>
-              <w:rPr>
-                <w:sz w:val="18"/>
-              </w:rPr>
-              <w:t xml:space="preserve">id</w:t>
-            </w:r>
-          </w:p>
-        </w:tc>
-        <w:tc>
-          <w:tcPr>
-            <w:tcW w:w="1400" w:type="dxa"/>
-            <w:vAlign w:val="center"/>
-          </w:tcPr>
-          <w:p>
-            <w:pPr>
-              <w:keepLines/>
-              <w:spacing w:line="240" w:lineRule="auto"/>
-              <w:jc w:val="center"/>
-            </w:pPr>
-            <w:r>
-              <w:rPr>
-                <w:sz w:val="18"/>
-              </w:rPr>
-              <w:t xml:space="preserve">UUID</w:t>
-            </w:r>
-          </w:p>
-        </w:tc>
-        <w:tc>
-          <w:tcPr>
-            <w:tcW w:w="1100" w:type="dxa"/>
-            <w:vAlign w:val="center"/>
-          </w:tcPr>
-          <w:p>
-            <w:pPr>
-              <w:keepLines/>
-              <w:spacing w:line="240" w:lineRule="auto"/>
-              <w:jc w:val="center"/>
-            </w:pPr>
-            <w:r>
-              <w:rPr>
-                <w:sz w:val="18"/>
-              </w:rPr>
-              <w:t xml:space="preserve">Sim</w:t>
-            </w:r>
-          </w:p>
-        </w:tc>
-        <w:tc>
-          <w:tcPr>
-            <w:tcW w:w="4670" w:type="dxa"/>
-            <w:vAlign w:val="center"/>
-          </w:tcPr>
-          <w:p>
-            <w:pPr>
-              <w:keepLines/>
-              <w:spacing w:line="240" w:lineRule="auto"/>
-              <w:jc w:val="center"/>
-            </w:pPr>
-            <w:r>
-              <w:rPr>
-                <w:sz w:val="18"/>
-              </w:rPr>
-              <w:t xml:space="preserve">Identificador único do registro</w:t>
-            </w:r>
-          </w:p>
-        </w:tc>
-      </w:tr>
-      <w:tr>
-        <w:trPr>
-          <w:cantSplit/>
-          <w:jc w:val="center"/>
-        </w:trPr>
-        <w:tc>
-          <w:tcPr>
-            <w:tcW w:w="1900" w:type="dxa"/>
-            <w:vAlign w:val="center"/>
-          </w:tcPr>
-          <w:p>
-            <w:pPr>
-              <w:keepLines/>
-              <w:spacing w:line="240" w:lineRule="auto"/>
-              <w:jc w:val="center"/>
-            </w:pPr>
-            <w:r>
-              <w:rPr>
-                <w:sz w:val="18"/>
-              </w:rPr>
-              <w:t xml:space="preserve">refund_id</w:t>
-            </w:r>
-          </w:p>
-        </w:tc>
-        <w:tc>
-          <w:tcPr>
-            <w:tcW w:w="1400" w:type="dxa"/>
-            <w:vAlign w:val="center"/>
-          </w:tcPr>
-          <w:p>
-            <w:pPr>
-              <w:keepLines/>
-              <w:spacing w:line="240" w:lineRule="auto"/>
-              <w:jc w:val="center"/>
-            </w:pPr>
-            <w:r>
-              <w:rPr>
-                <w:sz w:val="18"/>
-              </w:rPr>
-              <w:t xml:space="preserve">UUID</w:t>
-            </w:r>
-          </w:p>
-        </w:tc>
-        <w:tc>
-          <w:tcPr>
-            <w:tcW w:w="1100" w:type="dxa"/>
-            <w:vAlign w:val="center"/>
-          </w:tcPr>
-          <w:p>
-            <w:pPr>
-              <w:keepLines/>
-              <w:spacing w:line="240" w:lineRule="auto"/>
-              <w:jc w:val="center"/>
-            </w:pPr>
-            <w:r>
-              <w:rPr>
-                <w:sz w:val="18"/>
-              </w:rPr>
-              <w:t xml:space="preserve">Sim</w:t>
-            </w:r>
-          </w:p>
-        </w:tc>
-        <w:tc>
-          <w:tcPr>
-            <w:tcW w:w="4670" w:type="dxa"/>
-            <w:vAlign w:val="center"/>
-          </w:tcPr>
-          <w:p>
-            <w:pPr>
-              <w:keepLines/>
-              <w:spacing w:line="240" w:lineRule="auto"/>
-              <w:jc w:val="center"/>
-            </w:pPr>
-            <w:r>
-              <w:rPr>
-                <w:sz w:val="18"/>
-              </w:rPr>
-              <w:t xml:space="preserve">Referência ao estorno. Chave estrangeira para a tabela refunds</w:t>
-            </w:r>
-          </w:p>
-        </w:tc>
-      </w:tr>
-      <w:tr>
-        <w:trPr>
-          <w:cantSplit/>
-          <w:jc w:val="center"/>
-        </w:trPr>
-        <w:tc>
-          <w:tcPr>
-            <w:tcW w:w="1900" w:type="dxa"/>
-            <w:vAlign w:val="center"/>
-          </w:tcPr>
-          <w:p>
-            <w:pPr>
-              <w:keepLines/>
-              <w:spacing w:line="240" w:lineRule="auto"/>
-              <w:jc w:val="center"/>
-            </w:pPr>
-            <w:r>
-              <w:rPr>
-                <w:sz w:val="18"/>
-              </w:rPr>
-              <w:t xml:space="preserve">order_item_id</w:t>
-            </w:r>
-          </w:p>
-        </w:tc>
-        <w:tc>
-          <w:tcPr>
-            <w:tcW w:w="1400" w:type="dxa"/>
-            <w:vAlign w:val="center"/>
-          </w:tcPr>
-          <w:p>
-            <w:pPr>
-              <w:keepLines/>
-              <w:spacing w:line="240" w:lineRule="auto"/>
-              <w:jc w:val="center"/>
-            </w:pPr>
-            <w:r>
-              <w:rPr>
-                <w:sz w:val="18"/>
-              </w:rPr>
-              <w:t xml:space="preserve">UUID</w:t>
-            </w:r>
-          </w:p>
-        </w:tc>
-        <w:tc>
-          <w:tcPr>
-            <w:tcW w:w="1100" w:type="dxa"/>
-            <w:vAlign w:val="center"/>
-          </w:tcPr>
-          <w:p>
-            <w:pPr>
-              <w:keepLines/>
-              <w:spacing w:line="240" w:lineRule="auto"/>
-              <w:jc w:val="center"/>
-            </w:pPr>
-            <w:r>
-              <w:rPr>
-                <w:sz w:val="18"/>
-              </w:rPr>
-              <w:t xml:space="preserve">Sim</w:t>
-            </w:r>
-          </w:p>
-        </w:tc>
-        <w:tc>
-          <w:tcPr>
-            <w:tcW w:w="4670" w:type="dxa"/>
-            <w:vAlign w:val="center"/>
-          </w:tcPr>
-          <w:p>
-            <w:pPr>
-              <w:keepLines/>
-              <w:spacing w:line="240" w:lineRule="auto"/>
-              <w:jc w:val="center"/>
-            </w:pPr>
-            <w:r>
-              <w:rPr>
-                <w:sz w:val="18"/>
-              </w:rPr>
-              <w:t xml:space="preserve">Referência ao item do pedido estornado. Chave estrangeira para a tabela order_items</w:t>
-            </w:r>
-          </w:p>
-        </w:tc>
-      </w:tr>
-      <w:tr>
-        <w:trPr>
-          <w:cantSplit/>
-          <w:jc w:val="center"/>
-        </w:trPr>
-        <w:tc>
-          <w:tcPr>
-            <w:tcW w:w="1900" w:type="dxa"/>
-            <w:vAlign w:val="center"/>
-          </w:tcPr>
-          <w:p>
-            <w:pPr>
-              <w:keepLines/>
-              <w:spacing w:line="240" w:lineRule="auto"/>
-              <w:jc w:val="center"/>
-            </w:pPr>
-            <w:r>
-              <w:rPr>
-                <w:sz w:val="18"/>
-              </w:rPr>
-              <w:t xml:space="preserve">quantity</w:t>
-            </w:r>
-          </w:p>
-        </w:tc>
-        <w:tc>
-          <w:tcPr>
-            <w:tcW w:w="1400" w:type="dxa"/>
-            <w:vAlign w:val="center"/>
-          </w:tcPr>
-          <w:p>
-            <w:pPr>
-              <w:keepLines/>
-              <w:spacing w:line="240" w:lineRule="auto"/>
-              <w:jc w:val="center"/>
-            </w:pPr>
-            <w:r>
-              <w:rPr>
-                <w:sz w:val="18"/>
-              </w:rPr>
-              <w:t xml:space="preserve">INTEGER</w:t>
-            </w:r>
-          </w:p>
-        </w:tc>
-        <w:tc>
-          <w:tcPr>
-            <w:tcW w:w="1100" w:type="dxa"/>
-            <w:vAlign w:val="center"/>
-          </w:tcPr>
-          <w:p>
-            <w:pPr>
-              <w:keepLines/>
-              <w:spacing w:line="240" w:lineRule="auto"/>
-              <w:jc w:val="center"/>
-            </w:pPr>
-            <w:r>
-              <w:rPr>
-                <w:sz w:val="18"/>
-              </w:rPr>
-              <w:t xml:space="preserve">Sim</w:t>
-            </w:r>
-          </w:p>
-        </w:tc>
-        <w:tc>
-          <w:tcPr>
-            <w:tcW w:w="4670" w:type="dxa"/>
-            <w:vAlign w:val="center"/>
-          </w:tcPr>
-          <w:p>
-            <w:pPr>
-              <w:keepLines/>
-              <w:spacing w:line="240" w:lineRule="auto"/>
-              <w:jc w:val="center"/>
-            </w:pPr>
-            <w:r>
-              <w:rPr>
-                <w:sz w:val="18"/>
-              </w:rPr>
-              <w:t xml:space="preserve">Quantidade estornada do item</w:t>
-            </w:r>
-          </w:p>
-        </w:tc>
-      </w:tr>
-      <w:tr>
-        <w:trPr>
-          <w:cantSplit/>
-          <w:jc w:val="center"/>
-        </w:trPr>
-        <w:tc>
-          <w:tcPr>
-            <w:tcW w:w="1900" w:type="dxa"/>
-            <w:vAlign w:val="center"/>
-          </w:tcPr>
-          <w:p>
-            <w:pPr>
-              <w:keepLines/>
-              <w:spacing w:line="240" w:lineRule="auto"/>
-              <w:jc w:val="center"/>
-            </w:pPr>
-            <w:r>
-              <w:rPr>
-                <w:sz w:val="18"/>
-              </w:rPr>
-              <w:t xml:space="preserve">amount</w:t>
-            </w:r>
-          </w:p>
-        </w:tc>
-        <w:tc>
-          <w:tcPr>
-            <w:tcW w:w="1400" w:type="dxa"/>
-            <w:vAlign w:val="center"/>
-          </w:tcPr>
-          <w:p>
-            <w:pPr>
-              <w:keepLines/>
-              <w:spacing w:line="240" w:lineRule="auto"/>
-              <w:jc w:val="center"/>
-            </w:pPr>
-            <w:r>
-              <w:rPr>
-                <w:sz w:val="18"/>
-              </w:rPr>
-              <w:t xml:space="preserve">DECIMAL</w:t>
-            </w:r>
-          </w:p>
-        </w:tc>
-        <w:tc>
-          <w:tcPr>
-            <w:tcW w:w="1100" w:type="dxa"/>
-            <w:vAlign w:val="center"/>
-          </w:tcPr>
-          <w:p>
-            <w:pPr>
-              <w:keepLines/>
-              <w:spacing w:line="240" w:lineRule="auto"/>
-              <w:jc w:val="center"/>
-            </w:pPr>
-            <w:r>
-              <w:rPr>
-                <w:sz w:val="18"/>
-              </w:rPr>
-              <w:t xml:space="preserve">Sim</w:t>
-            </w:r>
-          </w:p>
-        </w:tc>
-        <w:tc>
-          <w:tcPr>
-            <w:tcW w:w="4670" w:type="dxa"/>
-            <w:vAlign w:val="center"/>
-          </w:tcPr>
-          <w:p>
-            <w:pPr>
-              <w:keepLines/>
-              <w:spacing w:line="240" w:lineRule="auto"/>
-              <w:jc w:val="center"/>
-            </w:pPr>
-            <w:r>
-              <w:rPr>
-                <w:sz w:val="18"/>
-              </w:rPr>
-              <w:t xml:space="preserve">Valor estornado referente ao item</w:t>
-            </w:r>
-          </w:p>
-        </w:tc>
-      </w:tr>
-      <w:tr>
-        <w:trPr>
-          <w:cantSplit/>
-          <w:jc w:val="center"/>
-        </w:trPr>
-        <w:tc>
-          <w:tcPr>
-            <w:tcW w:w="1900" w:type="dxa"/>
-            <w:vAlign w:val="center"/>
-          </w:tcPr>
-          <w:p>
-            <w:pPr>
-              <w:keepLines/>
-              <w:spacing w:line="240" w:lineRule="auto"/>
-              <w:jc w:val="center"/>
-            </w:pPr>
-            <w:r>
-              <w:rPr>
-                <w:sz w:val="18"/>
-              </w:rPr>
-              <w:t xml:space="preserve">created_at</w:t>
-            </w:r>
-          </w:p>
-        </w:tc>
-        <w:tc>
-          <w:tcPr>
-            <w:tcW w:w="1400" w:type="dxa"/>
-            <w:vAlign w:val="center"/>
-          </w:tcPr>
-          <w:p>
-            <w:pPr>
-              <w:keepLines/>
-              <w:spacing w:line="240" w:lineRule="auto"/>
-              <w:jc w:val="center"/>
-            </w:pPr>
-            <w:r>
-              <w:rPr>
-                <w:sz w:val="18"/>
-              </w:rPr>
-              <w:t xml:space="preserve">TIMESTAMPTZ</w:t>
-            </w:r>
-          </w:p>
-        </w:tc>
-        <w:tc>
-          <w:tcPr>
-            <w:tcW w:w="1100" w:type="dxa"/>
-            <w:vAlign w:val="center"/>
-          </w:tcPr>
-          <w:p>
-            <w:pPr>
-              <w:keepLines/>
-              <w:spacing w:line="240" w:lineRule="auto"/>
-              <w:jc w:val="center"/>
-            </w:pPr>
-            <w:r>
-              <w:rPr>
-                <w:sz w:val="18"/>
-              </w:rPr>
-              <w:t xml:space="preserve">Sim</w:t>
-            </w:r>
-          </w:p>
-        </w:tc>
-        <w:tc>
-          <w:tcPr>
-            <w:tcW w:w="4670" w:type="dxa"/>
-            <w:vAlign w:val="center"/>
-          </w:tcPr>
-          <w:p>
-            <w:pPr>
-              <w:keepLines/>
-              <w:spacing w:line="240" w:lineRule="auto"/>
-              <w:jc w:val="center"/>
-            </w:pPr>
-            <w:r>
-              <w:rPr>
-                <w:sz w:val="18"/>
-              </w:rPr>
-              <w:t xml:space="preserve">Data e hora de criação do registro</w:t>
-            </w:r>
-          </w:p>
-        </w:tc>
-      </w:tr>
-      <w:tr>
-        <w:trPr>
-          <w:cantSplit/>
-          <w:jc w:val="center"/>
-        </w:trPr>
-        <w:tc>
-          <w:tcPr>
-            <w:tcW w:w="1900" w:type="dxa"/>
-            <w:vAlign w:val="center"/>
-          </w:tcPr>
-          <w:p>
-            <w:pPr>
-              <w:keepLines/>
-              <w:spacing w:line="240" w:lineRule="auto"/>
-              <w:jc w:val="center"/>
-            </w:pPr>
-            <w:r>
-              <w:rPr>
-                <w:sz w:val="18"/>
-              </w:rPr>
-              <w:t xml:space="preserve">updated_at</w:t>
-            </w:r>
-          </w:p>
-        </w:tc>
-        <w:tc>
-          <w:tcPr>
-            <w:tcW w:w="1400" w:type="dxa"/>
-            <w:vAlign w:val="center"/>
-          </w:tcPr>
-          <w:p>
-            <w:pPr>
-              <w:keepLines/>
-              <w:spacing w:line="240" w:lineRule="auto"/>
-              <w:jc w:val="center"/>
-            </w:pPr>
-            <w:r>
-              <w:rPr>
-                <w:sz w:val="18"/>
-              </w:rPr>
-              <w:t xml:space="preserve">TIMESTAMPTZ</w:t>
-            </w:r>
-          </w:p>
-        </w:tc>
-        <w:tc>
-          <w:tcPr>
-            <w:tcW w:w="1100" w:type="dxa"/>
-            <w:vAlign w:val="center"/>
-          </w:tcPr>
-          <w:p>
-            <w:pPr>
-              <w:keepLines/>
-              <w:spacing w:line="240" w:lineRule="auto"/>
-              <w:jc w:val="center"/>
-            </w:pPr>
-            <w:r>
-              <w:rPr>
-                <w:sz w:val="18"/>
-              </w:rPr>
-              <w:t xml:space="preserve">Sim</w:t>
-            </w:r>
-          </w:p>
-        </w:tc>
-        <w:tc>
-          <w:tcPr>
-            <w:tcW w:w="4670" w:type="dxa"/>
-            <w:vAlign w:val="center"/>
-          </w:tcPr>
-          <w:p>
-            <w:pPr>
-              <w:keepLines/>
-              <w:spacing w:line="240" w:lineRule="auto"/>
-              <w:jc w:val="center"/>
-            </w:pPr>
-            <w:r>
-              <w:rPr>
-                <w:sz w:val="18"/>
-              </w:rPr>
-              <w:t xml:space="preserve">Data e hora da última alteração do registro</w:t>
-            </w:r>
-          </w:p>
-        </w:tc>
-      </w:tr>
-    </w:tbl>
-    <w:p/>
-    <w:p/>
-    <w:p>
-      <w:pPr>
-        <w:pStyle w:val="Ttulo1"/>
-        <w:keepNext/>
-        <w:spacing w:line="360" w:lineRule="auto"/>
-      </w:pPr>
-      <w:bookmarkStart w:id="32" w:name="_Toc237459132"/>
-      <w:r>
-        <w:t>9 MODELO DE NEGÓCIO</w:t>
-      </w:r>
-      <w:bookmarkEnd w:id="32"/>
-    </w:p>
-    <w:p/>
-    <w:p>
-      <w:pPr>
-        <w:pStyle w:val="Ttulo2"/>
-        <w:keepNext/>
-        <w:spacing w:line="360" w:lineRule="auto"/>
-      </w:pPr>
-      <w:bookmarkStart w:id="33" w:name="_Toc237459133"/>
-      <w:r>
-        <w:t>9.1 Modelo de Receita</w:t>
-      </w:r>
-      <w:bookmarkEnd w:id="33"/>
-    </w:p>
-    <w:p/>
-    <w:p>
-      <w:pPr>
-        <w:spacing w:line="360" w:lineRule="auto"/>
-        <w:ind w:firstLine="706"/>
-        <w:jc w:val="both"/>
-      </w:pPr>
-      <w:r>
-        <w:t xml:space="preserve">A plataforma adota o modelo de taxa por transação, cobrando 5% sobre o valor total de cada pedido realizado. Esse percentual é descontado automaticamente a cada transação via split do Pagar.me, sem necessidade de nenhuma ação manual de cobrança. A taxa do meio de pagamento cobrada pelo Pagar.me e eventuais chargebacks ficam a cargo do estabelecimento, que recebe os 95% restantes, da mesma forma que já ocorre com as máquinas de cartão. O modelo foi escolhido por três razões principais: elimina completamente a barreira de entrada para o estabelecimento, que não paga nada adiantado para começar a usar a plataforma; alinha diretamente os interesses da plataforma com os do estabelecimento, pois ambos só ganham quando o evento acontece e gera pedidos; e é praticamente invisível para o consumidor final, representando menos de R$ 1,00 a cada R$ 20,00 em compras.</w:t>
+        <w:t xml:space="preserve">A plataforma adota o modelo de taxa por transação, cobrando 5% sobre o valor total de cada pedido realizado. Esse percentual é repassado automaticamente à plataforma a cada transação, pelo split do Mercado Pago, sem necessidade de nenhuma ação manual de cobrança. A taxa do meio de pagamento cobrada pelo Mercado Pago e eventuais chargebacks ficam a cargo do estabelecimento, que recebe o restante diretamente na própria conta Mercado Pago, da mesma forma que já ocorre com as máquinas de cartão. O modelo foi escolhido por três razões principais: elimina completamente a barreira de entrada para o estabelecimento, que não paga nada adiantado para começar a usar a plataforma; alinha diretamente os interesses da plataforma com os do estabelecimento, pois ambos só ganham quando o evento acontece e gera pedidos; e é praticamente invisível para o consumidor final, representando menos de R$ 1,00 a cada R$ 20,00 em compras.</w:t>
       </w:r>
     </w:p>
     <w:p/>
@@ -20283,7 +19002,7 @@
         <w:jc w:val="both"/>
       </w:pPr>
       <w:r>
-        <w:t xml:space="preserve">Protótipo do consumidor e operador: simula o fluxo completo do consumidor, desde a tela de seleção de evento, passando pelo cardápio com itens esgotados, pelo pagamento via Pix com QR Code, código copia e cola e contagem regressiva, e pelo formulário de cartão com tratamento de recusa, até o comprovante com QR Code e status em tempo real. Inclui os avisos de pedido em aberto no topo do cardápio. Do lado do operador, simula o login com código, o scanner com câmera simulada, o pedido reservado com as ações de confirmar entrega, cancelar atendimento e marcar item esgotado com estorno, e as mensagens de erro de leitura.</w:t>
+        <w:t xml:space="preserve">Protótipo do consumidor e operador: simula o fluxo completo do consumidor, desde a tela de seleção de evento, passando pelo cardápio com itens esgotados, pelo pagamento via Pix com QR Code, código copia e cola e contagem regressiva, e pelo formulário de cartão com tratamento de recusa, até o comprovante com QR Code e status em tempo real. Inclui os avisos de pedido em aberto no topo do cardápio. Do lado do operador, simula o login com código, o scanner com câmera simulada, o pedido reservado com as ações de confirmar entrega, cancelar atendimento e indicar itens que acabaram, e as mensagens de erro de leitura.</w:t>
       </w:r>
     </w:p>
     <w:p>
@@ -20298,7 +19017,7 @@
         <w:jc w:val="both"/>
       </w:pPr>
       <w:r>
-        <w:t xml:space="preserve">Protótipo do estabelecimento: simula o login e o cadastro com CPF ou CNPJ, o aviso de cadastro aguardando aprovação, o dashboard de faturamento em tempo real, a listagem de eventos com status calculado, a criação de eventos a partir de cardápios reutilizáveis e a publicação, o gerenciamento de cardápios e dos itens do evento com controle de disponibilidade, o cadastro de operadores com código exibido uma única vez e envio pelo WhatsApp, a tela de link e QR Code fixo, o acompanhamento de pedidos ao vivo e a auditoria de estornos.</w:t>
+        <w:t xml:space="preserve">Protótipo do estabelecimento: simula o login e o cadastro com CPF ou CNPJ e a conexão da conta Mercado Pago, o aviso de cadastro aguardando aprovação, o dashboard de faturamento em tempo real, a listagem de eventos com status calculado, a criação de eventos a partir de cardápios reutilizáveis e a publicação, o gerenciamento de cardápios e dos itens do evento com controle de disponibilidade, o cadastro de operadores com código exibido uma única vez e envio pelo WhatsApp, a tela de link e QR Code fixo e o acompanhamento de pedidos ao vivo, com os itens não entregues.</w:t>
       </w:r>
     </w:p>
     <w:p>
@@ -20313,7 +19032,7 @@
         <w:jc w:val="both"/>
       </w:pPr>
       <w:r>
-        <w:t xml:space="preserve">Protótipo do administrador: simula o login, a visão geral do dia, o faturamento mensal com gráfico de vendas por dia e tabela por estabelecimento, a busca de pedido pelo código com o histórico completo e a análise de cadastros, com as listas de cadastros pendentes, aprovados e rejeitados, os dados e as verificações de cada estabelecimento, a aprovação e a rejeição com confirmação e a alteração excepcional do endereço do link, com o aviso de que os QR Codes já impressos deixam de funcionar.</w:t>
+        <w:t xml:space="preserve">Protótipo do administrador: simula o login, a visão geral do dia, o faturamento mensal com gráfico de vendas por dia e tabela por estabelecimento, a busca de pedido pelo código com o histórico completo e a análise de cadastros, com as listas de cadastros pendentes, aprovados e rejeitados, os dados e as verificações de cada estabelecimento, inclusive a conta Mercado Pago conectada, a aprovação e a rejeição com confirmação e a alteração excepcional do endereço do link, com o aviso de que os QR Codes já impressos deixam de funcionar.</w:t>
       </w:r>
     </w:p>
     <w:p/>
@@ -20489,7 +19208,7 @@
               <w:rPr>
                 <w:sz w:val="18"/>
               </w:rPr>
-              <w:t xml:space="preserve">QR Code fixo do estabelecimento, tela de seleção de evento, cardápios reutilizáveis, pagamento via Pix e cartão, QR Code do comprovante, app do operador com scanner e estorno de itens esgotados, painel do estabelecimento básico, painel do administrador com aprovação de cadastros, faturamento mensal e busca de pedidos</w:t>
+              <w:t xml:space="preserve">QR Code fixo do estabelecimento, tela de seleção de evento, cardápios reutilizáveis, pagamento via Pix e cartão, QR Code do comprovante, app do operador com scanner e registro de itens esgotados, painel do estabelecimento básico, painel do administrador com aprovação de cadastros, faturamento mensal e busca de pedidos</w:t>
             </w:r>
           </w:p>
         </w:tc>
@@ -20552,7 +19271,7 @@
               <w:rPr>
                 <w:sz w:val="18"/>
               </w:rPr>
-              <w:t xml:space="preserve">Dashboard completo com gráficos, relatórios por período, histórico de eventos, busca e filtro de operadores, métricas individuais por operador, status online e offline dos operadores, categorias de cardápio personalizáveis</w:t>
+              <w:t xml:space="preserve">Dashboard completo com gráficos, relatórios por período, histórico de eventos, busca e filtro de operadores, métricas individuais por operador, status online e offline dos operadores, categorias de cardápio personalizáveis, estornos pela plataforma</w:t>
             </w:r>
           </w:p>
         </w:tc>
@@ -20823,7 +19542,7 @@
         <w:spacing w:after="240" w:line="240" w:lineRule="auto"/>
       </w:pPr>
       <w:r>
-        <w:t>PAGAR.ME. Documentação da API. Disponível em: https://docs.pagar.me/. Acesso em: 12 ago. 2026.</w:t>
+        <w:t xml:space="preserve">MERCADO PAGO. Split de pagamentos: integrar o checkout. Mercado Pago Developers. Disponível em: https://www.mercadopago.com.br/developers/pt/docs/split-payments/split-1-1/integration-configuration/integrate-marketplace. Acesso em: 15 out. 2026.</w:t>
       </w:r>
     </w:p>
     <w:p>
@@ -20831,7 +19550,7 @@
         <w:spacing w:after="240" w:line="240" w:lineRule="auto"/>
       </w:pPr>
       <w:r>
-        <w:t xml:space="preserve">PAGAR.ME. Estorno: como estornar uma transação. Central de Ajuda Pagar.me. Disponível em: https://pagarme.helpjuice.com/pt_BR/p1-transa%C3%A7%C3%B5es-e-estornos/estorno-como-estornar-uma-transa%C3%A7%C3%A3o. Acesso em: 29 set. 2026.</w:t>
+        <w:t xml:space="preserve">RAILWAY. Pricing. Railway Documentation. Disponível em: https://docs.railway.com/pricing. Acesso em: 12 ago. 2026.</w:t>
       </w:r>
     </w:p>
     <w:p>
@@ -20839,7 +19558,7 @@
         <w:spacing w:after="240" w:line="240" w:lineRule="auto"/>
       </w:pPr>
       <w:r>
-        <w:t xml:space="preserve">RAILWAY. Pricing. Railway Documentation. Disponível em: https://docs.railway.com/pricing. Acesso em: 12 ago. 2026.</w:t>
+        <w:t>SÃO PAULO CONVENTION &amp; VISITORS BUREAU. São Paulo registra alta de 60% no número de eventos realizados no primeiro semestre desse ano. M.I.C.E.&amp;B. – SP para Eventos &amp; Negócios, 8 jul. 2025. Disponível em: https://mice.visitesaopaulo.com/sao-paulo-registra-alta-de-60-no-numero-de-eventos-realizados-no-primeiro-semestre-desse-ano/. Acesso em: 12 ago. 2026.</w:t>
       </w:r>
     </w:p>
     <w:p>
@@ -20848,14 +19567,6 @@
       </w:pPr>
       <w:r>
         <w:t xml:space="preserve">SUPABASE. Supabase documentation. Disponível em: https://supabase.com/docs. Acesso em: 29 set. 2026.</w:t>
-      </w:r>
-    </w:p>
-    <w:p>
-      <w:pPr>
-        <w:spacing w:after="240" w:line="240" w:lineRule="auto"/>
-      </w:pPr>
-      <w:r>
-        <w:t>SÃO PAULO CONVENTION &amp; VISITORS BUREAU. São Paulo registra alta de 60% no número de eventos realizados no primeiro semestre desse ano. M.I.C.E.&amp;B. – SP para Eventos &amp; Negócios, 8 jul. 2025. Disponível em: https://mice.visitesaopaulo.com/sao-paulo-registra-alta-de-60-no-numero-de-eventos-realizados-no-primeiro-semestre-desse-ano/. Acesso em: 12 ago. 2026.</w:t>
       </w:r>
     </w:p>
     <w:sectPr>

</xml_diff>